<commit_message>
sync main @ ee61af0
</commit_message>
<xml_diff>
--- a/docs/requirements/InterviewBuddy_Vision_Document.docx
+++ b/docs/requirements/InterviewBuddy_Vision_Document.docx
@@ -7,21 +7,11 @@
         <w:pStyle w:val="Title"/>
         <w:jc w:val="right"/>
       </w:pPr>
-      <w:r>
-        <w:fldChar w:fldCharType="begin"/>
-      </w:r>
-      <w:r>
-        <w:instrText xml:space="preserve"> SUBJECT  \* MERGEFORMAT </w:instrText>
-      </w:r>
-      <w:r>
-        <w:fldChar w:fldCharType="separate"/>
-      </w:r>
-      <w:r>
-        <w:t>InterviewBuddy</w:t>
-      </w:r>
-      <w:r>
-        <w:fldChar w:fldCharType="end"/>
-      </w:r>
+      <w:fldSimple w:instr=" SUBJECT  \* MERGEFORMAT ">
+        <w:r>
+          <w:t>InterviewBuddy</w:t>
+        </w:r>
+      </w:fldSimple>
     </w:p>
     <w:p>
       <w:pPr>
@@ -46,7 +36,7 @@
         <w:rPr>
           <w:sz w:val="28"/>
         </w:rPr>
-        <w:t>Version 1.1</w:t>
+        <w:t>Version 1.2</w:t>
       </w:r>
     </w:p>
     <w:p>
@@ -61,7 +51,9 @@
     <w:p>
       <w:pPr>
         <w:sectPr>
-          <w:headerReference w:type="default" r:id="rId8"/>
+          <w:headerReference w:type="even" r:id="rId8"/>
+          <w:headerReference w:type="default" r:id="rId9"/>
+          <w:headerReference w:type="first" r:id="rId10"/>
           <w:pgSz w:w="12240" w:h="15840" w:code="1"/>
           <w:pgMar w:top="1440" w:right="1440" w:bottom="1440" w:left="1440" w:header="720" w:footer="720" w:gutter="0"/>
           <w:cols w:space="720"/>
@@ -296,6 +288,64 @@
           </w:p>
         </w:tc>
       </w:tr>
+      <w:tr>
+        <w:tc>
+          <w:tcPr>
+            <w:tcW w:w="2304" w:type="dxa"/>
+          </w:tcPr>
+          <w:p>
+            <w:pPr>
+              <w:pStyle w:val="BodyText"/>
+              <w:ind w:left="0"/>
+            </w:pPr>
+            <w:r>
+              <w:t>30/Oct/26</w:t>
+            </w:r>
+          </w:p>
+        </w:tc>
+        <w:tc>
+          <w:tcPr>
+            <w:tcW w:w="1152" w:type="dxa"/>
+          </w:tcPr>
+          <w:p>
+            <w:pPr>
+              <w:pStyle w:val="BodyText"/>
+              <w:ind w:left="0"/>
+            </w:pPr>
+            <w:r>
+              <w:t>1.2</w:t>
+            </w:r>
+          </w:p>
+        </w:tc>
+        <w:tc>
+          <w:tcPr>
+            <w:tcW w:w="3744" w:type="dxa"/>
+          </w:tcPr>
+          <w:p>
+            <w:pPr>
+              <w:pStyle w:val="BodyText"/>
+              <w:ind w:left="0"/>
+            </w:pPr>
+            <w:r>
+              <w:t>PA2 update. Addressed the lecturer review of PA1: several problem and position statements from different viewpoints (2.1, 2.2) and a new Administrator user group for content, reports and support (3.1–3.4, feature 5.12, NFR-SC-09). Made every non-functional requirement measurable with an ID and moved the measures and test methods to the new Supplementary Specification [6]. Aligned feature 5.3 with UC-05, recorded Supabase as the chosen backend, clarified how CV data is stored and updated reference [3] to Plan v1.2.</w:t>
+            </w:r>
+          </w:p>
+        </w:tc>
+        <w:tc>
+          <w:tcPr>
+            <w:tcW w:w="2304" w:type="dxa"/>
+          </w:tcPr>
+          <w:p>
+            <w:pPr>
+              <w:pStyle w:val="BodyText"/>
+              <w:ind w:left="0"/>
+            </w:pPr>
+            <w:r>
+              <w:t>Nguyen Dang Hoang Khang</w:t>
+            </w:r>
+          </w:p>
+        </w:tc>
+      </w:tr>
     </w:tbl>
     <w:p/>
     <w:p>
@@ -373,7 +423,7 @@
         <w:rPr>
           <w:noProof/>
         </w:rPr>
-        <w:instrText xml:space="preserve"> PAGEREF _Toc243064920 \h </w:instrText>
+        <w:instrText xml:space="preserve"> PAGEREF _Toc244288156 \h </w:instrText>
       </w:r>
       <w:r>
         <w:rPr>
@@ -453,7 +503,7 @@
         <w:rPr>
           <w:noProof/>
         </w:rPr>
-        <w:instrText xml:space="preserve"> PAGEREF _Toc243064921 \h </w:instrText>
+        <w:instrText xml:space="preserve"> PAGEREF _Toc244288157 \h </w:instrText>
       </w:r>
       <w:r>
         <w:rPr>
@@ -533,7 +583,7 @@
         <w:rPr>
           <w:noProof/>
         </w:rPr>
-        <w:instrText xml:space="preserve"> PAGEREF _Toc243064922 \h </w:instrText>
+        <w:instrText xml:space="preserve"> PAGEREF _Toc244288158 \h </w:instrText>
       </w:r>
       <w:r>
         <w:rPr>
@@ -613,7 +663,7 @@
         <w:rPr>
           <w:noProof/>
         </w:rPr>
-        <w:instrText xml:space="preserve"> PAGEREF _Toc243064923 \h </w:instrText>
+        <w:instrText xml:space="preserve"> PAGEREF _Toc244288159 \h </w:instrText>
       </w:r>
       <w:r>
         <w:rPr>
@@ -693,7 +743,7 @@
         <w:rPr>
           <w:noProof/>
         </w:rPr>
-        <w:instrText xml:space="preserve"> PAGEREF _Toc243064924 \h </w:instrText>
+        <w:instrText xml:space="preserve"> PAGEREF _Toc244288160 \h </w:instrText>
       </w:r>
       <w:r>
         <w:rPr>
@@ -773,7 +823,7 @@
         <w:rPr>
           <w:noProof/>
         </w:rPr>
-        <w:instrText xml:space="preserve"> PAGEREF _Toc243064925 \h </w:instrText>
+        <w:instrText xml:space="preserve"> PAGEREF _Toc244288161 \h </w:instrText>
       </w:r>
       <w:r>
         <w:rPr>
@@ -790,7 +840,7 @@
         <w:rPr>
           <w:noProof/>
         </w:rPr>
-        <w:t>5</w:t>
+        <w:t>7</w:t>
       </w:r>
       <w:r>
         <w:rPr>
@@ -853,7 +903,7 @@
         <w:rPr>
           <w:noProof/>
         </w:rPr>
-        <w:instrText xml:space="preserve"> PAGEREF _Toc243064926 \h </w:instrText>
+        <w:instrText xml:space="preserve"> PAGEREF _Toc244288162 \h </w:instrText>
       </w:r>
       <w:r>
         <w:rPr>
@@ -870,7 +920,7 @@
         <w:rPr>
           <w:noProof/>
         </w:rPr>
-        <w:t>5</w:t>
+        <w:t>7</w:t>
       </w:r>
       <w:r>
         <w:rPr>
@@ -933,7 +983,7 @@
         <w:rPr>
           <w:noProof/>
         </w:rPr>
-        <w:instrText xml:space="preserve"> PAGEREF _Toc243064927 \h </w:instrText>
+        <w:instrText xml:space="preserve"> PAGEREF _Toc244288163 \h </w:instrText>
       </w:r>
       <w:r>
         <w:rPr>
@@ -950,7 +1000,7 @@
         <w:rPr>
           <w:noProof/>
         </w:rPr>
-        <w:t>6</w:t>
+        <w:t>7</w:t>
       </w:r>
       <w:r>
         <w:rPr>
@@ -1013,7 +1063,7 @@
         <w:rPr>
           <w:noProof/>
         </w:rPr>
-        <w:instrText xml:space="preserve"> PAGEREF _Toc243064928 \h </w:instrText>
+        <w:instrText xml:space="preserve"> PAGEREF _Toc244288164 \h </w:instrText>
       </w:r>
       <w:r>
         <w:rPr>
@@ -1030,7 +1080,7 @@
         <w:rPr>
           <w:noProof/>
         </w:rPr>
-        <w:t>6</w:t>
+        <w:t>8</w:t>
       </w:r>
       <w:r>
         <w:rPr>
@@ -1093,7 +1143,7 @@
         <w:rPr>
           <w:noProof/>
         </w:rPr>
-        <w:instrText xml:space="preserve"> PAGEREF _Toc243064929 \h </w:instrText>
+        <w:instrText xml:space="preserve"> PAGEREF _Toc244288165 \h </w:instrText>
       </w:r>
       <w:r>
         <w:rPr>
@@ -1110,7 +1160,7 @@
         <w:rPr>
           <w:noProof/>
         </w:rPr>
-        <w:t>7</w:t>
+        <w:t>9</w:t>
       </w:r>
       <w:r>
         <w:rPr>
@@ -1173,7 +1223,7 @@
         <w:rPr>
           <w:noProof/>
         </w:rPr>
-        <w:instrText xml:space="preserve"> PAGEREF _Toc243064930 \h </w:instrText>
+        <w:instrText xml:space="preserve"> PAGEREF _Toc244288166 \h </w:instrText>
       </w:r>
       <w:r>
         <w:rPr>
@@ -1190,7 +1240,7 @@
         <w:rPr>
           <w:noProof/>
         </w:rPr>
-        <w:t>8</w:t>
+        <w:t>10</w:t>
       </w:r>
       <w:r>
         <w:rPr>
@@ -1253,7 +1303,7 @@
         <w:rPr>
           <w:noProof/>
         </w:rPr>
-        <w:instrText xml:space="preserve"> PAGEREF _Toc243064931 \h </w:instrText>
+        <w:instrText xml:space="preserve"> PAGEREF _Toc244288167 \h </w:instrText>
       </w:r>
       <w:r>
         <w:rPr>
@@ -1270,7 +1320,7 @@
         <w:rPr>
           <w:noProof/>
         </w:rPr>
-        <w:t>9</w:t>
+        <w:t>11</w:t>
       </w:r>
       <w:r>
         <w:rPr>
@@ -1333,7 +1383,7 @@
         <w:rPr>
           <w:noProof/>
         </w:rPr>
-        <w:instrText xml:space="preserve"> PAGEREF _Toc243064932 \h </w:instrText>
+        <w:instrText xml:space="preserve"> PAGEREF _Toc244288168 \h </w:instrText>
       </w:r>
       <w:r>
         <w:rPr>
@@ -1350,7 +1400,7 @@
         <w:rPr>
           <w:noProof/>
         </w:rPr>
-        <w:t>9</w:t>
+        <w:t>11</w:t>
       </w:r>
       <w:r>
         <w:rPr>
@@ -1413,7 +1463,7 @@
         <w:rPr>
           <w:noProof/>
         </w:rPr>
-        <w:instrText xml:space="preserve"> PAGEREF _Toc243064933 \h </w:instrText>
+        <w:instrText xml:space="preserve"> PAGEREF _Toc244288169 \h </w:instrText>
       </w:r>
       <w:r>
         <w:rPr>
@@ -1430,7 +1480,7 @@
         <w:rPr>
           <w:noProof/>
         </w:rPr>
-        <w:t>9</w:t>
+        <w:t>11</w:t>
       </w:r>
       <w:r>
         <w:rPr>
@@ -1493,7 +1543,7 @@
         <w:rPr>
           <w:noProof/>
         </w:rPr>
-        <w:instrText xml:space="preserve"> PAGEREF _Toc243064934 \h </w:instrText>
+        <w:instrText xml:space="preserve"> PAGEREF _Toc244288170 \h </w:instrText>
       </w:r>
       <w:r>
         <w:rPr>
@@ -1510,7 +1560,7 @@
         <w:rPr>
           <w:noProof/>
         </w:rPr>
-        <w:t>10</w:t>
+        <w:t>12</w:t>
       </w:r>
       <w:r>
         <w:rPr>
@@ -1573,7 +1623,7 @@
         <w:rPr>
           <w:noProof/>
         </w:rPr>
-        <w:instrText xml:space="preserve"> PAGEREF _Toc243064935 \h </w:instrText>
+        <w:instrText xml:space="preserve"> PAGEREF _Toc244288171 \h </w:instrText>
       </w:r>
       <w:r>
         <w:rPr>
@@ -1590,7 +1640,7 @@
         <w:rPr>
           <w:noProof/>
         </w:rPr>
-        <w:t>10</w:t>
+        <w:t>12</w:t>
       </w:r>
       <w:r>
         <w:rPr>
@@ -1653,7 +1703,7 @@
         <w:rPr>
           <w:noProof/>
         </w:rPr>
-        <w:instrText xml:space="preserve"> PAGEREF _Toc243064936 \h </w:instrText>
+        <w:instrText xml:space="preserve"> PAGEREF _Toc244288172 \h </w:instrText>
       </w:r>
       <w:r>
         <w:rPr>
@@ -1670,7 +1720,7 @@
         <w:rPr>
           <w:noProof/>
         </w:rPr>
-        <w:t>10</w:t>
+        <w:t>12</w:t>
       </w:r>
       <w:r>
         <w:rPr>
@@ -1733,7 +1783,7 @@
         <w:rPr>
           <w:noProof/>
         </w:rPr>
-        <w:instrText xml:space="preserve"> PAGEREF _Toc243064937 \h </w:instrText>
+        <w:instrText xml:space="preserve"> PAGEREF _Toc244288173 \h </w:instrText>
       </w:r>
       <w:r>
         <w:rPr>
@@ -1750,7 +1800,7 @@
         <w:rPr>
           <w:noProof/>
         </w:rPr>
-        <w:t>10</w:t>
+        <w:t>12</w:t>
       </w:r>
       <w:r>
         <w:rPr>
@@ -1813,7 +1863,7 @@
         <w:rPr>
           <w:noProof/>
         </w:rPr>
-        <w:instrText xml:space="preserve"> PAGEREF _Toc243064938 \h </w:instrText>
+        <w:instrText xml:space="preserve"> PAGEREF _Toc244288174 \h </w:instrText>
       </w:r>
       <w:r>
         <w:rPr>
@@ -1830,7 +1880,7 @@
         <w:rPr>
           <w:noProof/>
         </w:rPr>
-        <w:t>10</w:t>
+        <w:t>12</w:t>
       </w:r>
       <w:r>
         <w:rPr>
@@ -1893,7 +1943,7 @@
         <w:rPr>
           <w:noProof/>
         </w:rPr>
-        <w:instrText xml:space="preserve"> PAGEREF _Toc243064939 \h </w:instrText>
+        <w:instrText xml:space="preserve"> PAGEREF _Toc244288175 \h </w:instrText>
       </w:r>
       <w:r>
         <w:rPr>
@@ -1910,7 +1960,7 @@
         <w:rPr>
           <w:noProof/>
         </w:rPr>
-        <w:t>10</w:t>
+        <w:t>13</w:t>
       </w:r>
       <w:r>
         <w:rPr>
@@ -1973,7 +2023,7 @@
         <w:rPr>
           <w:noProof/>
         </w:rPr>
-        <w:instrText xml:space="preserve"> PAGEREF _Toc243064940 \h </w:instrText>
+        <w:instrText xml:space="preserve"> PAGEREF _Toc244288176 \h </w:instrText>
       </w:r>
       <w:r>
         <w:rPr>
@@ -1990,7 +2040,7 @@
         <w:rPr>
           <w:noProof/>
         </w:rPr>
-        <w:t>10</w:t>
+        <w:t>13</w:t>
       </w:r>
       <w:r>
         <w:rPr>
@@ -2053,7 +2103,7 @@
         <w:rPr>
           <w:noProof/>
         </w:rPr>
-        <w:instrText xml:space="preserve"> PAGEREF _Toc243064941 \h </w:instrText>
+        <w:instrText xml:space="preserve"> PAGEREF _Toc244288177 \h </w:instrText>
       </w:r>
       <w:r>
         <w:rPr>
@@ -2070,7 +2120,7 @@
         <w:rPr>
           <w:noProof/>
         </w:rPr>
-        <w:t>11</w:t>
+        <w:t>13</w:t>
       </w:r>
       <w:r>
         <w:rPr>
@@ -2133,7 +2183,7 @@
         <w:rPr>
           <w:noProof/>
         </w:rPr>
-        <w:instrText xml:space="preserve"> PAGEREF _Toc243064942 \h </w:instrText>
+        <w:instrText xml:space="preserve"> PAGEREF _Toc244288178 \h </w:instrText>
       </w:r>
       <w:r>
         <w:rPr>
@@ -2150,7 +2200,7 @@
         <w:rPr>
           <w:noProof/>
         </w:rPr>
-        <w:t>11</w:t>
+        <w:t>13</w:t>
       </w:r>
       <w:r>
         <w:rPr>
@@ -2213,7 +2263,7 @@
         <w:rPr>
           <w:noProof/>
         </w:rPr>
-        <w:instrText xml:space="preserve"> PAGEREF _Toc243064943 \h </w:instrText>
+        <w:instrText xml:space="preserve"> PAGEREF _Toc244288179 \h </w:instrText>
       </w:r>
       <w:r>
         <w:rPr>
@@ -2230,7 +2280,7 @@
         <w:rPr>
           <w:noProof/>
         </w:rPr>
-        <w:t>11</w:t>
+        <w:t>13</w:t>
       </w:r>
       <w:r>
         <w:rPr>
@@ -2293,7 +2343,7 @@
         <w:rPr>
           <w:noProof/>
         </w:rPr>
-        <w:instrText xml:space="preserve"> PAGEREF _Toc243064944 \h </w:instrText>
+        <w:instrText xml:space="preserve"> PAGEREF _Toc244288180 \h </w:instrText>
       </w:r>
       <w:r>
         <w:rPr>
@@ -2310,7 +2360,7 @@
         <w:rPr>
           <w:noProof/>
         </w:rPr>
-        <w:t>11</w:t>
+        <w:t>13</w:t>
       </w:r>
       <w:r>
         <w:rPr>
@@ -2373,7 +2423,7 @@
         <w:rPr>
           <w:noProof/>
         </w:rPr>
-        <w:instrText xml:space="preserve"> PAGEREF _Toc243064945 \h </w:instrText>
+        <w:instrText xml:space="preserve"> PAGEREF _Toc244288181 \h </w:instrText>
       </w:r>
       <w:r>
         <w:rPr>
@@ -2390,7 +2440,87 @@
         <w:rPr>
           <w:noProof/>
         </w:rPr>
-        <w:t>11</w:t>
+        <w:t>13</w:t>
+      </w:r>
+      <w:r>
+        <w:rPr>
+          <w:noProof/>
+        </w:rPr>
+        <w:fldChar w:fldCharType="end"/>
+      </w:r>
+    </w:p>
+    <w:p>
+      <w:pPr>
+        <w:pStyle w:val="TOC2"/>
+        <w:tabs>
+          <w:tab w:val="left" w:pos="1200"/>
+        </w:tabs>
+        <w:rPr>
+          <w:rFonts w:asciiTheme="minorHAnsi" w:eastAsiaTheme="minorEastAsia" w:hAnsiTheme="minorHAnsi" w:cstheme="minorBidi"/>
+          <w:noProof/>
+          <w:kern w:val="2"/>
+          <w:sz w:val="24"/>
+          <w:szCs w:val="24"/>
+          <w14:ligatures w14:val="standardContextual"/>
+        </w:rPr>
+      </w:pPr>
+      <w:r>
+        <w:rPr>
+          <w:noProof/>
+        </w:rPr>
+        <w:t>5.12</w:t>
+      </w:r>
+      <w:r>
+        <w:rPr>
+          <w:rFonts w:asciiTheme="minorHAnsi" w:eastAsiaTheme="minorEastAsia" w:hAnsiTheme="minorHAnsi" w:cstheme="minorBidi"/>
+          <w:noProof/>
+          <w:kern w:val="2"/>
+          <w:sz w:val="24"/>
+          <w:szCs w:val="24"/>
+          <w14:ligatures w14:val="standardContextual"/>
+        </w:rPr>
+        <w:tab/>
+      </w:r>
+      <w:r>
+        <w:rPr>
+          <w:noProof/>
+        </w:rPr>
+        <w:t>Administration: Content, Reports and Support</w:t>
+      </w:r>
+      <w:r>
+        <w:rPr>
+          <w:noProof/>
+        </w:rPr>
+        <w:tab/>
+      </w:r>
+      <w:r>
+        <w:rPr>
+          <w:noProof/>
+        </w:rPr>
+        <w:fldChar w:fldCharType="begin"/>
+      </w:r>
+      <w:r>
+        <w:rPr>
+          <w:noProof/>
+        </w:rPr>
+        <w:instrText xml:space="preserve"> PAGEREF _Toc244288182 \h </w:instrText>
+      </w:r>
+      <w:r>
+        <w:rPr>
+          <w:noProof/>
+        </w:rPr>
+      </w:r>
+      <w:r>
+        <w:rPr>
+          <w:noProof/>
+        </w:rPr>
+        <w:fldChar w:fldCharType="separate"/>
+      </w:r>
+      <w:r>
+        <w:rPr>
+          <w:noProof/>
+        </w:rPr>
+        <w:t>13</w:t>
       </w:r>
       <w:r>
         <w:rPr>
@@ -2453,7 +2583,7 @@
         <w:rPr>
           <w:noProof/>
         </w:rPr>
-        <w:instrText xml:space="preserve"> PAGEREF _Toc243064946 \h </w:instrText>
+        <w:instrText xml:space="preserve"> PAGEREF _Toc244288183 \h </w:instrText>
       </w:r>
       <w:r>
         <w:rPr>
@@ -2470,7 +2600,7 @@
         <w:rPr>
           <w:noProof/>
         </w:rPr>
-        <w:t>11</w:t>
+        <w:t>13</w:t>
       </w:r>
       <w:r>
         <w:rPr>
@@ -2502,16 +2632,16 @@
       <w:bookmarkStart w:id="0" w:name="_Toc456598586"/>
       <w:bookmarkStart w:id="1" w:name="_Toc456600917"/>
       <w:bookmarkStart w:id="2" w:name="_Toc512930904"/>
-      <w:bookmarkStart w:id="3" w:name="_Toc243064920"/>
-      <w:bookmarkStart w:id="4" w:name="_Toc436203377"/>
-      <w:bookmarkStart w:id="5" w:name="_Toc452813577"/>
+      <w:bookmarkStart w:id="3" w:name="_Toc436203377"/>
+      <w:bookmarkStart w:id="4" w:name="_Toc452813577"/>
+      <w:bookmarkStart w:id="5" w:name="_Toc244288156"/>
       <w:r>
         <w:t>Introduction</w:t>
       </w:r>
       <w:bookmarkEnd w:id="0"/>
       <w:bookmarkEnd w:id="1"/>
       <w:bookmarkEnd w:id="2"/>
-      <w:bookmarkEnd w:id="3"/>
+      <w:bookmarkEnd w:id="5"/>
     </w:p>
     <w:p>
       <w:pPr>
@@ -2545,7 +2675,7 @@
       <w:bookmarkStart w:id="6" w:name="_Toc456598590"/>
       <w:bookmarkStart w:id="7" w:name="_Toc456600921"/>
       <w:bookmarkStart w:id="8" w:name="_Toc512930905"/>
-      <w:bookmarkStart w:id="9" w:name="_Toc243064921"/>
+      <w:bookmarkStart w:id="9" w:name="_Toc244288157"/>
       <w:r>
         <w:t>References</w:t>
       </w:r>
@@ -2614,10 +2744,7 @@
         <w:rPr>
           <w:b/>
         </w:rPr>
-        <w:t>[3] InterviewBuddy – Software Development Plan, version 1.0 (PA1)</w:t>
-      </w:r>
-      <w:r>
-        <w:t>, Group 3 (24C01), October 2026. GitHub repository, /docs/management.</w:t>
+        <w:t>[3] InterviewBuddy – Software Development Plan, version 1.2 (PA2), Group 3 (24C01), October 2026. GitHub repository, /docs/management.</w:t>
       </w:r>
     </w:p>
     <w:p>
@@ -2671,15 +2798,32 @@
     </w:p>
     <w:p>
       <w:pPr>
+        <w:pStyle w:val="BodyText"/>
+        <w:numPr>
+          <w:ilvl w:val="0"/>
+          <w:numId w:val="9"/>
+        </w:numPr>
+        <w:spacing w:after="60"/>
+        <w:ind w:left="1080"/>
+      </w:pPr>
+      <w:r>
+        <w:rPr>
+          <w:b/>
+        </w:rPr>
+        <w:t>[6] InterviewBuddy – Supplementary Specification, version 1.0 (PA2), Group 3 (24C01), October 2026. GitHub repository, /docs/requirements.</w:t>
+      </w:r>
+    </w:p>
+    <w:p>
+      <w:pPr>
         <w:pStyle w:val="Heading1"/>
       </w:pPr>
       <w:bookmarkStart w:id="10" w:name="_Toc512930906"/>
-      <w:bookmarkStart w:id="11" w:name="_Toc243064922"/>
+      <w:bookmarkStart w:id="11" w:name="_Toc244288158"/>
       <w:r>
         <w:t>Positioning</w:t>
       </w:r>
+      <w:bookmarkEnd w:id="3"/>
       <w:bookmarkEnd w:id="4"/>
-      <w:bookmarkEnd w:id="5"/>
       <w:bookmarkEnd w:id="10"/>
       <w:bookmarkEnd w:id="11"/>
     </w:p>
@@ -2690,7 +2834,7 @@
       <w:bookmarkStart w:id="12" w:name="_Toc436203379"/>
       <w:bookmarkStart w:id="13" w:name="_Toc452813579"/>
       <w:bookmarkStart w:id="14" w:name="_Toc512930907"/>
-      <w:bookmarkStart w:id="15" w:name="_Toc243064923"/>
+      <w:bookmarkStart w:id="15" w:name="_Toc244288159"/>
       <w:r>
         <w:t>Problem Statement</w:t>
       </w:r>
@@ -2698,6 +2842,18 @@
       <w:bookmarkEnd w:id="13"/>
       <w:bookmarkEnd w:id="14"/>
       <w:bookmarkEnd w:id="15"/>
+    </w:p>
+    <w:p>
+      <w:pPr>
+        <w:pStyle w:val="BodyText"/>
+        <w:keepNext/>
+      </w:pPr>
+      <w:r>
+        <w:rPr>
+          <w:b/>
+        </w:rPr>
+        <w:t>Problem statement 1 – Candidates</w:t>
+      </w:r>
     </w:p>
     <w:tbl>
       <w:tblPr>
@@ -2888,20 +3044,20 @@
               <w:ind w:left="0"/>
             </w:pPr>
             <w:r>
-              <w:t>• honest, detailed feedback that refers to the candidate's own answer, with a rubric score and a sample answer</w:t>
-            </w:r>
-          </w:p>
-          <w:p>
-            <w:pPr>
-              <w:pStyle w:val="BodyText"/>
-              <w:ind w:left="0"/>
-            </w:pPr>
-            <w:r>
-              <w:t xml:space="preserve">• practice questions and progress tracking focused on the </w:t>
+              <w:t xml:space="preserve">• honest, detailed feedback that refers to the candidate's own </w:t>
             </w:r>
             <w:r>
               <w:lastRenderedPageBreak/>
-              <w:t>candidate's weakest areas</w:t>
+              <w:t>answer, with a rubric score and a sample answer</w:t>
+            </w:r>
+          </w:p>
+          <w:p>
+            <w:pPr>
+              <w:pStyle w:val="BodyText"/>
+              <w:ind w:left="0"/>
+            </w:pPr>
+            <w:r>
+              <w:t>• practice questions and progress tracking focused on the candidate's weakest areas</w:t>
             </w:r>
           </w:p>
           <w:p>
@@ -2911,6 +3067,439 @@
             </w:pPr>
             <w:r>
               <w:t>• free, available any time, in Vietnamese or English, by typing or by voice, with clear control over personal data</w:t>
+            </w:r>
+          </w:p>
+        </w:tc>
+      </w:tr>
+    </w:tbl>
+    <w:p>
+      <w:pPr>
+        <w:pStyle w:val="BodyText"/>
+        <w:keepNext/>
+      </w:pPr>
+      <w:r>
+        <w:rPr>
+          <w:b/>
+        </w:rPr>
+        <w:lastRenderedPageBreak/>
+        <w:t>Problem statement 2 – Mentors, lecturers and career advisors</w:t>
+      </w:r>
+    </w:p>
+    <w:tbl>
+      <w:tblPr>
+        <w:tblW w:w="0" w:type="auto"/>
+        <w:tblInd w:w="828" w:type="dxa"/>
+        <w:tblLayout w:type="fixed"/>
+        <w:tblLook w:val="0000" w:firstRow="0" w:lastRow="0" w:firstColumn="0" w:lastColumn="0" w:noHBand="0" w:noVBand="0"/>
+      </w:tblPr>
+      <w:tblGrid>
+        <w:gridCol w:w="2970"/>
+        <w:gridCol w:w="5220"/>
+      </w:tblGrid>
+      <w:tr>
+        <w:tc>
+          <w:tcPr>
+            <w:tcW w:w="2970" w:type="dxa"/>
+            <w:tcBorders>
+              <w:top w:val="single" w:sz="12" w:space="0" w:color="auto"/>
+              <w:left w:val="single" w:sz="12" w:space="0" w:color="auto"/>
+              <w:bottom w:val="single" w:sz="6" w:space="0" w:color="auto"/>
+              <w:right w:val="single" w:sz="12" w:space="0" w:color="auto"/>
+            </w:tcBorders>
+            <w:shd w:val="pct25" w:color="auto" w:fill="auto"/>
+          </w:tcPr>
+          <w:p>
+            <w:pPr>
+              <w:pStyle w:val="BodyText"/>
+              <w:keepNext/>
+              <w:ind w:left="72"/>
+            </w:pPr>
+            <w:r>
+              <w:t>The problem of</w:t>
+            </w:r>
+          </w:p>
+        </w:tc>
+        <w:tc>
+          <w:tcPr>
+            <w:tcW w:w="5220" w:type="dxa"/>
+            <w:tcBorders>
+              <w:top w:val="single" w:sz="12" w:space="0" w:color="auto"/>
+              <w:bottom w:val="single" w:sz="6" w:space="0" w:color="auto"/>
+              <w:right w:val="single" w:sz="12" w:space="0" w:color="auto"/>
+            </w:tcBorders>
+          </w:tcPr>
+          <w:p>
+            <w:pPr>
+              <w:pStyle w:val="BodyText"/>
+              <w:ind w:left="0"/>
+            </w:pPr>
+            <w:r>
+              <w:t>helping many students prepare for interviews with little time, and seeing their answers only through screenshots or what the student remembers</w:t>
+            </w:r>
+          </w:p>
+        </w:tc>
+      </w:tr>
+      <w:tr>
+        <w:tc>
+          <w:tcPr>
+            <w:tcW w:w="2970" w:type="dxa"/>
+            <w:tcBorders>
+              <w:top w:val="single" w:sz="6" w:space="0" w:color="auto"/>
+              <w:left w:val="single" w:sz="12" w:space="0" w:color="auto"/>
+              <w:bottom w:val="single" w:sz="6" w:space="0" w:color="auto"/>
+              <w:right w:val="single" w:sz="12" w:space="0" w:color="auto"/>
+            </w:tcBorders>
+            <w:shd w:val="pct25" w:color="auto" w:fill="auto"/>
+          </w:tcPr>
+          <w:p>
+            <w:pPr>
+              <w:pStyle w:val="BodyText"/>
+              <w:keepNext/>
+              <w:ind w:left="72"/>
+            </w:pPr>
+            <w:r>
+              <w:t>affects</w:t>
+            </w:r>
+          </w:p>
+        </w:tc>
+        <w:tc>
+          <w:tcPr>
+            <w:tcW w:w="5220" w:type="dxa"/>
+            <w:tcBorders>
+              <w:top w:val="single" w:sz="6" w:space="0" w:color="auto"/>
+              <w:bottom w:val="single" w:sz="6" w:space="0" w:color="auto"/>
+              <w:right w:val="single" w:sz="12" w:space="0" w:color="auto"/>
+            </w:tcBorders>
+          </w:tcPr>
+          <w:p>
+            <w:pPr>
+              <w:pStyle w:val="BodyText"/>
+              <w:ind w:left="0"/>
+            </w:pPr>
+            <w:r>
+              <w:t>seniors, lecturers and career advisors (7 of 15 respondents want mentor feedback), and the candidates who wait for their advice</w:t>
+            </w:r>
+          </w:p>
+        </w:tc>
+      </w:tr>
+      <w:tr>
+        <w:trPr>
+          <w:trHeight w:val="390"/>
+        </w:trPr>
+        <w:tc>
+          <w:tcPr>
+            <w:tcW w:w="2970" w:type="dxa"/>
+            <w:tcBorders>
+              <w:top w:val="single" w:sz="6" w:space="0" w:color="auto"/>
+              <w:left w:val="single" w:sz="12" w:space="0" w:color="auto"/>
+              <w:bottom w:val="single" w:sz="6" w:space="0" w:color="auto"/>
+              <w:right w:val="single" w:sz="12" w:space="0" w:color="auto"/>
+            </w:tcBorders>
+            <w:shd w:val="pct25" w:color="auto" w:fill="auto"/>
+          </w:tcPr>
+          <w:p>
+            <w:pPr>
+              <w:pStyle w:val="BodyText"/>
+              <w:keepNext/>
+              <w:ind w:left="72"/>
+            </w:pPr>
+            <w:r>
+              <w:t>the impact of which is</w:t>
+            </w:r>
+          </w:p>
+        </w:tc>
+        <w:tc>
+          <w:tcPr>
+            <w:tcW w:w="5220" w:type="dxa"/>
+            <w:tcBorders>
+              <w:top w:val="single" w:sz="6" w:space="0" w:color="auto"/>
+              <w:bottom w:val="single" w:sz="6" w:space="0" w:color="auto"/>
+              <w:right w:val="single" w:sz="12" w:space="0" w:color="auto"/>
+            </w:tcBorders>
+          </w:tcPr>
+          <w:p>
+            <w:pPr>
+              <w:pStyle w:val="BodyText"/>
+              <w:ind w:left="0"/>
+            </w:pPr>
+            <w:r>
+              <w:t>advice comes late, is based on incomplete information and repeats the same basic comments; there is no record of the candidate's progress between two meetings</w:t>
+            </w:r>
+          </w:p>
+        </w:tc>
+      </w:tr>
+      <w:tr>
+        <w:tc>
+          <w:tcPr>
+            <w:tcW w:w="2970" w:type="dxa"/>
+            <w:tcBorders>
+              <w:top w:val="single" w:sz="6" w:space="0" w:color="auto"/>
+              <w:left w:val="single" w:sz="12" w:space="0" w:color="auto"/>
+              <w:bottom w:val="single" w:sz="6" w:space="0" w:color="auto"/>
+              <w:right w:val="single" w:sz="12" w:space="0" w:color="auto"/>
+            </w:tcBorders>
+            <w:shd w:val="pct25" w:color="auto" w:fill="auto"/>
+          </w:tcPr>
+          <w:p>
+            <w:pPr>
+              <w:pStyle w:val="BodyText"/>
+              <w:ind w:left="72"/>
+            </w:pPr>
+            <w:r>
+              <w:t>a successful solution would be</w:t>
+            </w:r>
+          </w:p>
+        </w:tc>
+        <w:tc>
+          <w:tcPr>
+            <w:tcW w:w="5220" w:type="dxa"/>
+            <w:tcBorders>
+              <w:top w:val="single" w:sz="6" w:space="0" w:color="auto"/>
+              <w:bottom w:val="single" w:sz="6" w:space="0" w:color="auto"/>
+              <w:right w:val="single" w:sz="12" w:space="0" w:color="auto"/>
+            </w:tcBorders>
+          </w:tcPr>
+          <w:p>
+            <w:pPr>
+              <w:pStyle w:val="BodyText"/>
+              <w:ind w:left="0"/>
+            </w:pPr>
+            <w:r>
+              <w:t>• a read-only report with the transcript, rubric scores and AI comments that the candidate decides to share</w:t>
+            </w:r>
+          </w:p>
+          <w:p>
+            <w:pPr>
+              <w:pStyle w:val="BodyText"/>
+              <w:ind w:left="0"/>
+            </w:pPr>
+            <w:r>
+              <w:t>• mentors spend their time on the hardest points instead of the basics</w:t>
+            </w:r>
+          </w:p>
+          <w:p>
+            <w:pPr>
+              <w:pStyle w:val="BodyText"/>
+              <w:ind w:left="0"/>
+            </w:pPr>
+            <w:r>
+              <w:t>• no account is needed, and the candidate can revoke the link at any time</w:t>
+            </w:r>
+          </w:p>
+        </w:tc>
+      </w:tr>
+    </w:tbl>
+    <w:p>
+      <w:pPr>
+        <w:pStyle w:val="BodyText"/>
+        <w:keepNext/>
+      </w:pPr>
+      <w:r>
+        <w:rPr>
+          <w:b/>
+        </w:rPr>
+        <w:t>Problem statement 3 – Administrators (operating the product)</w:t>
+      </w:r>
+    </w:p>
+    <w:tbl>
+      <w:tblPr>
+        <w:tblW w:w="0" w:type="auto"/>
+        <w:tblInd w:w="828" w:type="dxa"/>
+        <w:tblLayout w:type="fixed"/>
+        <w:tblLook w:val="0000" w:firstRow="0" w:lastRow="0" w:firstColumn="0" w:lastColumn="0" w:noHBand="0" w:noVBand="0"/>
+      </w:tblPr>
+      <w:tblGrid>
+        <w:gridCol w:w="2970"/>
+        <w:gridCol w:w="5220"/>
+      </w:tblGrid>
+      <w:tr>
+        <w:tc>
+          <w:tcPr>
+            <w:tcW w:w="2970" w:type="dxa"/>
+            <w:tcBorders>
+              <w:top w:val="single" w:sz="12" w:space="0" w:color="auto"/>
+              <w:left w:val="single" w:sz="12" w:space="0" w:color="auto"/>
+              <w:bottom w:val="single" w:sz="6" w:space="0" w:color="auto"/>
+              <w:right w:val="single" w:sz="12" w:space="0" w:color="auto"/>
+            </w:tcBorders>
+            <w:shd w:val="pct25" w:color="auto" w:fill="auto"/>
+          </w:tcPr>
+          <w:p>
+            <w:pPr>
+              <w:pStyle w:val="BodyText"/>
+              <w:keepNext/>
+              <w:ind w:left="72"/>
+            </w:pPr>
+            <w:r>
+              <w:t>The problem of</w:t>
+            </w:r>
+          </w:p>
+        </w:tc>
+        <w:tc>
+          <w:tcPr>
+            <w:tcW w:w="5220" w:type="dxa"/>
+            <w:tcBorders>
+              <w:top w:val="single" w:sz="12" w:space="0" w:color="auto"/>
+              <w:bottom w:val="single" w:sz="6" w:space="0" w:color="auto"/>
+              <w:right w:val="single" w:sz="12" w:space="0" w:color="auto"/>
+            </w:tcBorders>
+          </w:tcPr>
+          <w:p>
+            <w:pPr>
+              <w:pStyle w:val="BodyText"/>
+              <w:ind w:left="0"/>
+            </w:pPr>
+            <w:r>
+              <w:t>keeping interview content, the scoring rubric and help texts up to date, and noticing problems (wrong AI feedback, quota errors, user questions) in a free AI product</w:t>
+            </w:r>
+          </w:p>
+        </w:tc>
+      </w:tr>
+      <w:tr>
+        <w:tc>
+          <w:tcPr>
+            <w:tcW w:w="2970" w:type="dxa"/>
+            <w:tcBorders>
+              <w:top w:val="single" w:sz="6" w:space="0" w:color="auto"/>
+              <w:left w:val="single" w:sz="12" w:space="0" w:color="auto"/>
+              <w:bottom w:val="single" w:sz="6" w:space="0" w:color="auto"/>
+              <w:right w:val="single" w:sz="12" w:space="0" w:color="auto"/>
+            </w:tcBorders>
+            <w:shd w:val="pct25" w:color="auto" w:fill="auto"/>
+          </w:tcPr>
+          <w:p>
+            <w:pPr>
+              <w:pStyle w:val="BodyText"/>
+              <w:keepNext/>
+              <w:ind w:left="72"/>
+            </w:pPr>
+            <w:r>
+              <w:t>affects</w:t>
+            </w:r>
+          </w:p>
+        </w:tc>
+        <w:tc>
+          <w:tcPr>
+            <w:tcW w:w="5220" w:type="dxa"/>
+            <w:tcBorders>
+              <w:top w:val="single" w:sz="6" w:space="0" w:color="auto"/>
+              <w:bottom w:val="single" w:sz="6" w:space="0" w:color="auto"/>
+              <w:right w:val="single" w:sz="12" w:space="0" w:color="auto"/>
+            </w:tcBorders>
+          </w:tcPr>
+          <w:p>
+            <w:pPr>
+              <w:pStyle w:val="BodyText"/>
+              <w:ind w:left="0"/>
+            </w:pPr>
+            <w:r>
+              <w:t>the administrators – the development team during the course, later content or support staff – and indirectly every candidate</w:t>
+            </w:r>
+          </w:p>
+        </w:tc>
+      </w:tr>
+      <w:tr>
+        <w:trPr>
+          <w:trHeight w:val="390"/>
+        </w:trPr>
+        <w:tc>
+          <w:tcPr>
+            <w:tcW w:w="2970" w:type="dxa"/>
+            <w:tcBorders>
+              <w:top w:val="single" w:sz="6" w:space="0" w:color="auto"/>
+              <w:left w:val="single" w:sz="12" w:space="0" w:color="auto"/>
+              <w:bottom w:val="single" w:sz="6" w:space="0" w:color="auto"/>
+              <w:right w:val="single" w:sz="12" w:space="0" w:color="auto"/>
+            </w:tcBorders>
+            <w:shd w:val="pct25" w:color="auto" w:fill="auto"/>
+          </w:tcPr>
+          <w:p>
+            <w:pPr>
+              <w:pStyle w:val="BodyText"/>
+              <w:keepNext/>
+              <w:ind w:left="72"/>
+            </w:pPr>
+            <w:r>
+              <w:t>the impact of which is</w:t>
+            </w:r>
+          </w:p>
+        </w:tc>
+        <w:tc>
+          <w:tcPr>
+            <w:tcW w:w="5220" w:type="dxa"/>
+            <w:tcBorders>
+              <w:top w:val="single" w:sz="6" w:space="0" w:color="auto"/>
+              <w:bottom w:val="single" w:sz="6" w:space="0" w:color="auto"/>
+              <w:right w:val="single" w:sz="12" w:space="0" w:color="auto"/>
+            </w:tcBorders>
+          </w:tcPr>
+          <w:p>
+            <w:pPr>
+              <w:pStyle w:val="BodyText"/>
+              <w:ind w:left="0"/>
+            </w:pPr>
+            <w:r>
+              <w:t>without content management and reports, outdated questions and unclear rubric texts reach users, AI errors are noticed late, and user requests stay unanswered</w:t>
+            </w:r>
+          </w:p>
+        </w:tc>
+      </w:tr>
+      <w:tr>
+        <w:tc>
+          <w:tcPr>
+            <w:tcW w:w="2970" w:type="dxa"/>
+            <w:tcBorders>
+              <w:top w:val="single" w:sz="6" w:space="0" w:color="auto"/>
+              <w:left w:val="single" w:sz="12" w:space="0" w:color="auto"/>
+              <w:bottom w:val="single" w:sz="6" w:space="0" w:color="auto"/>
+              <w:right w:val="single" w:sz="12" w:space="0" w:color="auto"/>
+            </w:tcBorders>
+            <w:shd w:val="pct25" w:color="auto" w:fill="auto"/>
+          </w:tcPr>
+          <w:p>
+            <w:pPr>
+              <w:pStyle w:val="BodyText"/>
+              <w:ind w:left="72"/>
+            </w:pPr>
+            <w:r>
+              <w:t>a successful solution would be</w:t>
+            </w:r>
+          </w:p>
+        </w:tc>
+        <w:tc>
+          <w:tcPr>
+            <w:tcW w:w="5220" w:type="dxa"/>
+            <w:tcBorders>
+              <w:top w:val="single" w:sz="6" w:space="0" w:color="auto"/>
+              <w:bottom w:val="single" w:sz="6" w:space="0" w:color="auto"/>
+              <w:right w:val="single" w:sz="12" w:space="0" w:color="auto"/>
+            </w:tcBorders>
+          </w:tcPr>
+          <w:p>
+            <w:pPr>
+              <w:pStyle w:val="BodyText"/>
+              <w:ind w:left="0"/>
+            </w:pPr>
+            <w:r>
+              <w:t>• an admin area to create and update question templates, rubric descriptions and help pages without changing code</w:t>
+            </w:r>
+          </w:p>
+          <w:p>
+            <w:pPr>
+              <w:pStyle w:val="BodyText"/>
+              <w:ind w:left="0"/>
+            </w:pPr>
+            <w:r>
+              <w:t>• reports on usage, scores, AI errors and feedback that users flag as wrong</w:t>
+            </w:r>
+          </w:p>
+          <w:p>
+            <w:pPr>
+              <w:pStyle w:val="BodyText"/>
+              <w:ind w:left="0"/>
+            </w:pPr>
+            <w:r>
+              <w:t>• one place to answer support requests and handle data-deletion requests</w:t>
             </w:r>
           </w:p>
         </w:tc>
@@ -2925,9 +3514,8 @@
       <w:bookmarkStart w:id="18" w:name="_Toc436203380"/>
       <w:bookmarkStart w:id="19" w:name="_Toc452813580"/>
       <w:bookmarkStart w:id="20" w:name="_Toc512930908"/>
-      <w:bookmarkStart w:id="21" w:name="_Toc243064924"/>
-      <w:r>
-        <w:lastRenderedPageBreak/>
+      <w:bookmarkStart w:id="21" w:name="_Toc244288160"/>
+      <w:r>
         <w:t>Product Position Statement</w:t>
       </w:r>
       <w:bookmarkEnd w:id="16"/>
@@ -2936,6 +3524,18 @@
       <w:bookmarkEnd w:id="19"/>
       <w:bookmarkEnd w:id="20"/>
       <w:bookmarkEnd w:id="21"/>
+    </w:p>
+    <w:p>
+      <w:pPr>
+        <w:pStyle w:val="BodyText"/>
+        <w:keepNext/>
+      </w:pPr>
+      <w:r>
+        <w:rPr>
+          <w:b/>
+        </w:rPr>
+        <w:t>Position statement 1 – Candidates</w:t>
+      </w:r>
     </w:p>
     <w:tbl>
       <w:tblPr>
@@ -2967,6 +3567,7 @@
               <w:ind w:left="72"/>
             </w:pPr>
             <w:r>
+              <w:lastRenderedPageBreak/>
               <w:t>For</w:t>
             </w:r>
           </w:p>
@@ -3208,20 +3809,583 @@
     </w:tbl>
     <w:p>
       <w:pPr>
+        <w:pStyle w:val="BodyText"/>
+        <w:keepNext/>
+      </w:pPr>
+      <w:r>
+        <w:rPr>
+          <w:b/>
+        </w:rPr>
+        <w:t>Position statement 2 – Mentors and career advisors</w:t>
+      </w:r>
+    </w:p>
+    <w:tbl>
+      <w:tblPr>
+        <w:tblW w:w="0" w:type="auto"/>
+        <w:tblInd w:w="828" w:type="dxa"/>
+        <w:tblLayout w:type="fixed"/>
+        <w:tblLook w:val="0000" w:firstRow="0" w:lastRow="0" w:firstColumn="0" w:lastColumn="0" w:noHBand="0" w:noVBand="0"/>
+      </w:tblPr>
+      <w:tblGrid>
+        <w:gridCol w:w="2790"/>
+        <w:gridCol w:w="5400"/>
+      </w:tblGrid>
+      <w:tr>
+        <w:tc>
+          <w:tcPr>
+            <w:tcW w:w="2790" w:type="dxa"/>
+            <w:tcBorders>
+              <w:top w:val="single" w:sz="12" w:space="0" w:color="auto"/>
+              <w:left w:val="single" w:sz="12" w:space="0" w:color="auto"/>
+              <w:bottom w:val="single" w:sz="6" w:space="0" w:color="auto"/>
+              <w:right w:val="single" w:sz="12" w:space="0" w:color="auto"/>
+            </w:tcBorders>
+            <w:shd w:val="pct25" w:color="auto" w:fill="auto"/>
+          </w:tcPr>
+          <w:p>
+            <w:pPr>
+              <w:pStyle w:val="BodyText"/>
+              <w:keepNext/>
+              <w:ind w:left="72"/>
+            </w:pPr>
+            <w:r>
+              <w:t>For</w:t>
+            </w:r>
+          </w:p>
+        </w:tc>
+        <w:tc>
+          <w:tcPr>
+            <w:tcW w:w="5400" w:type="dxa"/>
+            <w:tcBorders>
+              <w:top w:val="single" w:sz="12" w:space="0" w:color="auto"/>
+              <w:bottom w:val="single" w:sz="6" w:space="0" w:color="auto"/>
+              <w:right w:val="single" w:sz="12" w:space="0" w:color="auto"/>
+            </w:tcBorders>
+          </w:tcPr>
+          <w:p>
+            <w:pPr>
+              <w:pStyle w:val="BodyText"/>
+              <w:ind w:left="0"/>
+            </w:pPr>
+            <w:r>
+              <w:t>seniors, lecturers and career advisors who help students prepare for interviews</w:t>
+            </w:r>
+          </w:p>
+        </w:tc>
+      </w:tr>
+      <w:tr>
+        <w:tc>
+          <w:tcPr>
+            <w:tcW w:w="2790" w:type="dxa"/>
+            <w:tcBorders>
+              <w:top w:val="single" w:sz="6" w:space="0" w:color="auto"/>
+              <w:left w:val="single" w:sz="12" w:space="0" w:color="auto"/>
+              <w:bottom w:val="single" w:sz="6" w:space="0" w:color="auto"/>
+              <w:right w:val="single" w:sz="12" w:space="0" w:color="auto"/>
+            </w:tcBorders>
+            <w:shd w:val="pct25" w:color="auto" w:fill="auto"/>
+          </w:tcPr>
+          <w:p>
+            <w:pPr>
+              <w:pStyle w:val="BodyText"/>
+              <w:keepNext/>
+              <w:ind w:left="72"/>
+            </w:pPr>
+            <w:r>
+              <w:t>Who</w:t>
+            </w:r>
+          </w:p>
+        </w:tc>
+        <w:tc>
+          <w:tcPr>
+            <w:tcW w:w="5400" w:type="dxa"/>
+            <w:tcBorders>
+              <w:top w:val="single" w:sz="6" w:space="0" w:color="auto"/>
+              <w:bottom w:val="single" w:sz="6" w:space="0" w:color="auto"/>
+              <w:right w:val="single" w:sz="12" w:space="0" w:color="auto"/>
+            </w:tcBorders>
+          </w:tcPr>
+          <w:p>
+            <w:pPr>
+              <w:pStyle w:val="BodyText"/>
+              <w:ind w:left="0"/>
+            </w:pPr>
+            <w:r>
+              <w:t>need to give useful advice quickly without sitting through every practice session</w:t>
+            </w:r>
+          </w:p>
+        </w:tc>
+      </w:tr>
+      <w:tr>
+        <w:tc>
+          <w:tcPr>
+            <w:tcW w:w="2790" w:type="dxa"/>
+            <w:tcBorders>
+              <w:top w:val="single" w:sz="6" w:space="0" w:color="auto"/>
+              <w:left w:val="single" w:sz="12" w:space="0" w:color="auto"/>
+              <w:bottom w:val="single" w:sz="6" w:space="0" w:color="auto"/>
+              <w:right w:val="single" w:sz="12" w:space="0" w:color="auto"/>
+            </w:tcBorders>
+            <w:shd w:val="pct25" w:color="auto" w:fill="auto"/>
+          </w:tcPr>
+          <w:p>
+            <w:pPr>
+              <w:pStyle w:val="BodyText"/>
+              <w:keepNext/>
+              <w:ind w:left="0"/>
+            </w:pPr>
+            <w:r>
+              <w:t>InterviewBuddy</w:t>
+            </w:r>
+          </w:p>
+        </w:tc>
+        <w:tc>
+          <w:tcPr>
+            <w:tcW w:w="5400" w:type="dxa"/>
+            <w:tcBorders>
+              <w:top w:val="single" w:sz="6" w:space="0" w:color="auto"/>
+              <w:bottom w:val="single" w:sz="6" w:space="0" w:color="auto"/>
+              <w:right w:val="single" w:sz="12" w:space="0" w:color="auto"/>
+            </w:tcBorders>
+          </w:tcPr>
+          <w:p>
+            <w:pPr>
+              <w:pStyle w:val="BodyText"/>
+              <w:ind w:left="0"/>
+            </w:pPr>
+            <w:r>
+              <w:t>is an AI-powered mock-interview website</w:t>
+            </w:r>
+          </w:p>
+        </w:tc>
+      </w:tr>
+      <w:tr>
+        <w:tc>
+          <w:tcPr>
+            <w:tcW w:w="2790" w:type="dxa"/>
+            <w:tcBorders>
+              <w:top w:val="single" w:sz="6" w:space="0" w:color="auto"/>
+              <w:left w:val="single" w:sz="12" w:space="0" w:color="auto"/>
+              <w:bottom w:val="single" w:sz="6" w:space="0" w:color="auto"/>
+              <w:right w:val="single" w:sz="12" w:space="0" w:color="auto"/>
+            </w:tcBorders>
+            <w:shd w:val="pct25" w:color="auto" w:fill="auto"/>
+          </w:tcPr>
+          <w:p>
+            <w:pPr>
+              <w:pStyle w:val="BodyText"/>
+              <w:keepNext/>
+              <w:ind w:left="72"/>
+            </w:pPr>
+            <w:r>
+              <w:t>That</w:t>
+            </w:r>
+          </w:p>
+        </w:tc>
+        <w:tc>
+          <w:tcPr>
+            <w:tcW w:w="5400" w:type="dxa"/>
+            <w:tcBorders>
+              <w:top w:val="single" w:sz="6" w:space="0" w:color="auto"/>
+              <w:bottom w:val="single" w:sz="6" w:space="0" w:color="auto"/>
+              <w:right w:val="single" w:sz="12" w:space="0" w:color="auto"/>
+            </w:tcBorders>
+          </w:tcPr>
+          <w:p>
+            <w:pPr>
+              <w:pStyle w:val="BodyText"/>
+              <w:ind w:left="0"/>
+            </w:pPr>
+            <w:r>
+              <w:t>lets a candidate share a read-only report with the full transcript, rubric scores and AI comments</w:t>
+            </w:r>
+          </w:p>
+        </w:tc>
+      </w:tr>
+      <w:tr>
+        <w:tc>
+          <w:tcPr>
+            <w:tcW w:w="2790" w:type="dxa"/>
+            <w:tcBorders>
+              <w:top w:val="single" w:sz="6" w:space="0" w:color="auto"/>
+              <w:left w:val="single" w:sz="12" w:space="0" w:color="auto"/>
+              <w:bottom w:val="single" w:sz="6" w:space="0" w:color="auto"/>
+              <w:right w:val="single" w:sz="12" w:space="0" w:color="auto"/>
+            </w:tcBorders>
+            <w:shd w:val="pct25" w:color="auto" w:fill="auto"/>
+          </w:tcPr>
+          <w:p>
+            <w:pPr>
+              <w:pStyle w:val="BodyText"/>
+              <w:keepNext/>
+              <w:ind w:left="72"/>
+            </w:pPr>
+            <w:r>
+              <w:t>Unlike</w:t>
+            </w:r>
+          </w:p>
+        </w:tc>
+        <w:tc>
+          <w:tcPr>
+            <w:tcW w:w="5400" w:type="dxa"/>
+            <w:tcBorders>
+              <w:top w:val="single" w:sz="6" w:space="0" w:color="auto"/>
+              <w:bottom w:val="single" w:sz="6" w:space="0" w:color="auto"/>
+              <w:right w:val="single" w:sz="12" w:space="0" w:color="auto"/>
+            </w:tcBorders>
+          </w:tcPr>
+          <w:p>
+            <w:pPr>
+              <w:pStyle w:val="BodyText"/>
+              <w:ind w:left="0"/>
+            </w:pPr>
+            <w:r>
+              <w:t>screenshots, chat messages or answers retold from memory</w:t>
+            </w:r>
+          </w:p>
+        </w:tc>
+      </w:tr>
+      <w:tr>
+        <w:tc>
+          <w:tcPr>
+            <w:tcW w:w="2790" w:type="dxa"/>
+            <w:tcBorders>
+              <w:top w:val="single" w:sz="6" w:space="0" w:color="auto"/>
+              <w:left w:val="single" w:sz="12" w:space="0" w:color="auto"/>
+              <w:bottom w:val="single" w:sz="12" w:space="0" w:color="auto"/>
+              <w:right w:val="single" w:sz="12" w:space="0" w:color="auto"/>
+            </w:tcBorders>
+            <w:shd w:val="pct25" w:color="auto" w:fill="auto"/>
+          </w:tcPr>
+          <w:p>
+            <w:pPr>
+              <w:pStyle w:val="BodyText"/>
+              <w:ind w:left="72"/>
+            </w:pPr>
+            <w:r>
+              <w:t>Our product</w:t>
+            </w:r>
+          </w:p>
+        </w:tc>
+        <w:tc>
+          <w:tcPr>
+            <w:tcW w:w="5400" w:type="dxa"/>
+            <w:tcBorders>
+              <w:top w:val="single" w:sz="6" w:space="0" w:color="auto"/>
+              <w:bottom w:val="single" w:sz="12" w:space="0" w:color="auto"/>
+              <w:right w:val="single" w:sz="12" w:space="0" w:color="auto"/>
+            </w:tcBorders>
+          </w:tcPr>
+          <w:p>
+            <w:pPr>
+              <w:pStyle w:val="BodyText"/>
+              <w:ind w:left="0"/>
+            </w:pPr>
+            <w:r>
+              <w:t>gives the mentor the full, structured picture in one link, needs no account, and stays under the candidate's control (the link can be revoked)</w:t>
+            </w:r>
+          </w:p>
+        </w:tc>
+      </w:tr>
+    </w:tbl>
+    <w:p>
+      <w:pPr>
+        <w:pStyle w:val="BodyText"/>
+        <w:keepNext/>
+      </w:pPr>
+      <w:r>
+        <w:rPr>
+          <w:b/>
+        </w:rPr>
+        <w:t>Position statement 3 – Administrators</w:t>
+      </w:r>
+    </w:p>
+    <w:tbl>
+      <w:tblPr>
+        <w:tblW w:w="0" w:type="auto"/>
+        <w:tblInd w:w="828" w:type="dxa"/>
+        <w:tblLayout w:type="fixed"/>
+        <w:tblLook w:val="0000" w:firstRow="0" w:lastRow="0" w:firstColumn="0" w:lastColumn="0" w:noHBand="0" w:noVBand="0"/>
+      </w:tblPr>
+      <w:tblGrid>
+        <w:gridCol w:w="2790"/>
+        <w:gridCol w:w="5400"/>
+      </w:tblGrid>
+      <w:tr>
+        <w:tc>
+          <w:tcPr>
+            <w:tcW w:w="2790" w:type="dxa"/>
+            <w:tcBorders>
+              <w:top w:val="single" w:sz="12" w:space="0" w:color="auto"/>
+              <w:left w:val="single" w:sz="12" w:space="0" w:color="auto"/>
+              <w:bottom w:val="single" w:sz="6" w:space="0" w:color="auto"/>
+              <w:right w:val="single" w:sz="12" w:space="0" w:color="auto"/>
+            </w:tcBorders>
+            <w:shd w:val="pct25" w:color="auto" w:fill="auto"/>
+          </w:tcPr>
+          <w:p>
+            <w:pPr>
+              <w:pStyle w:val="BodyText"/>
+              <w:keepNext/>
+              <w:ind w:left="72"/>
+            </w:pPr>
+            <w:r>
+              <w:t>For</w:t>
+            </w:r>
+          </w:p>
+        </w:tc>
+        <w:tc>
+          <w:tcPr>
+            <w:tcW w:w="5400" w:type="dxa"/>
+            <w:tcBorders>
+              <w:top w:val="single" w:sz="12" w:space="0" w:color="auto"/>
+              <w:bottom w:val="single" w:sz="6" w:space="0" w:color="auto"/>
+              <w:right w:val="single" w:sz="12" w:space="0" w:color="auto"/>
+            </w:tcBorders>
+          </w:tcPr>
+          <w:p>
+            <w:pPr>
+              <w:pStyle w:val="BodyText"/>
+              <w:ind w:left="0"/>
+            </w:pPr>
+            <w:r>
+              <w:t>the administrators who run InterviewBuddy (the development team during the course)</w:t>
+            </w:r>
+          </w:p>
+        </w:tc>
+      </w:tr>
+      <w:tr>
+        <w:tc>
+          <w:tcPr>
+            <w:tcW w:w="2790" w:type="dxa"/>
+            <w:tcBorders>
+              <w:top w:val="single" w:sz="6" w:space="0" w:color="auto"/>
+              <w:left w:val="single" w:sz="12" w:space="0" w:color="auto"/>
+              <w:bottom w:val="single" w:sz="6" w:space="0" w:color="auto"/>
+              <w:right w:val="single" w:sz="12" w:space="0" w:color="auto"/>
+            </w:tcBorders>
+            <w:shd w:val="pct25" w:color="auto" w:fill="auto"/>
+          </w:tcPr>
+          <w:p>
+            <w:pPr>
+              <w:pStyle w:val="BodyText"/>
+              <w:keepNext/>
+              <w:ind w:left="72"/>
+            </w:pPr>
+            <w:r>
+              <w:t>Who</w:t>
+            </w:r>
+          </w:p>
+        </w:tc>
+        <w:tc>
+          <w:tcPr>
+            <w:tcW w:w="5400" w:type="dxa"/>
+            <w:tcBorders>
+              <w:top w:val="single" w:sz="6" w:space="0" w:color="auto"/>
+              <w:bottom w:val="single" w:sz="6" w:space="0" w:color="auto"/>
+              <w:right w:val="single" w:sz="12" w:space="0" w:color="auto"/>
+            </w:tcBorders>
+          </w:tcPr>
+          <w:p>
+            <w:pPr>
+              <w:pStyle w:val="BodyText"/>
+              <w:ind w:left="0"/>
+            </w:pPr>
+            <w:r>
+              <w:t>need to keep content and AI quality under control at zero cost</w:t>
+            </w:r>
+          </w:p>
+        </w:tc>
+      </w:tr>
+      <w:tr>
+        <w:tc>
+          <w:tcPr>
+            <w:tcW w:w="2790" w:type="dxa"/>
+            <w:tcBorders>
+              <w:top w:val="single" w:sz="6" w:space="0" w:color="auto"/>
+              <w:left w:val="single" w:sz="12" w:space="0" w:color="auto"/>
+              <w:bottom w:val="single" w:sz="6" w:space="0" w:color="auto"/>
+              <w:right w:val="single" w:sz="12" w:space="0" w:color="auto"/>
+            </w:tcBorders>
+            <w:shd w:val="pct25" w:color="auto" w:fill="auto"/>
+          </w:tcPr>
+          <w:p>
+            <w:pPr>
+              <w:pStyle w:val="BodyText"/>
+              <w:keepNext/>
+              <w:ind w:left="0"/>
+            </w:pPr>
+            <w:r>
+              <w:t>InterviewBuddy</w:t>
+            </w:r>
+          </w:p>
+        </w:tc>
+        <w:tc>
+          <w:tcPr>
+            <w:tcW w:w="5400" w:type="dxa"/>
+            <w:tcBorders>
+              <w:top w:val="single" w:sz="6" w:space="0" w:color="auto"/>
+              <w:bottom w:val="single" w:sz="6" w:space="0" w:color="auto"/>
+              <w:right w:val="single" w:sz="12" w:space="0" w:color="auto"/>
+            </w:tcBorders>
+          </w:tcPr>
+          <w:p>
+            <w:pPr>
+              <w:pStyle w:val="BodyText"/>
+              <w:ind w:left="0"/>
+            </w:pPr>
+            <w:r>
+              <w:t>is an AI-powered mock-interview website</w:t>
+            </w:r>
+          </w:p>
+        </w:tc>
+      </w:tr>
+      <w:tr>
+        <w:tc>
+          <w:tcPr>
+            <w:tcW w:w="2790" w:type="dxa"/>
+            <w:tcBorders>
+              <w:top w:val="single" w:sz="6" w:space="0" w:color="auto"/>
+              <w:left w:val="single" w:sz="12" w:space="0" w:color="auto"/>
+              <w:bottom w:val="single" w:sz="6" w:space="0" w:color="auto"/>
+              <w:right w:val="single" w:sz="12" w:space="0" w:color="auto"/>
+            </w:tcBorders>
+            <w:shd w:val="pct25" w:color="auto" w:fill="auto"/>
+          </w:tcPr>
+          <w:p>
+            <w:pPr>
+              <w:pStyle w:val="BodyText"/>
+              <w:keepNext/>
+              <w:ind w:left="72"/>
+            </w:pPr>
+            <w:r>
+              <w:t>That</w:t>
+            </w:r>
+          </w:p>
+        </w:tc>
+        <w:tc>
+          <w:tcPr>
+            <w:tcW w:w="5400" w:type="dxa"/>
+            <w:tcBorders>
+              <w:top w:val="single" w:sz="6" w:space="0" w:color="auto"/>
+              <w:bottom w:val="single" w:sz="6" w:space="0" w:color="auto"/>
+              <w:right w:val="single" w:sz="12" w:space="0" w:color="auto"/>
+            </w:tcBorders>
+          </w:tcPr>
+          <w:p>
+            <w:pPr>
+              <w:pStyle w:val="BodyText"/>
+              <w:ind w:left="0"/>
+            </w:pPr>
+            <w:r>
+              <w:t>provides an admin area for content, usage and quality reports, and user support</w:t>
+            </w:r>
+          </w:p>
+        </w:tc>
+      </w:tr>
+      <w:tr>
+        <w:tc>
+          <w:tcPr>
+            <w:tcW w:w="2790" w:type="dxa"/>
+            <w:tcBorders>
+              <w:top w:val="single" w:sz="6" w:space="0" w:color="auto"/>
+              <w:left w:val="single" w:sz="12" w:space="0" w:color="auto"/>
+              <w:bottom w:val="single" w:sz="6" w:space="0" w:color="auto"/>
+              <w:right w:val="single" w:sz="12" w:space="0" w:color="auto"/>
+            </w:tcBorders>
+            <w:shd w:val="pct25" w:color="auto" w:fill="auto"/>
+          </w:tcPr>
+          <w:p>
+            <w:pPr>
+              <w:pStyle w:val="BodyText"/>
+              <w:keepNext/>
+              <w:ind w:left="72"/>
+            </w:pPr>
+            <w:r>
+              <w:t>Unlike</w:t>
+            </w:r>
+          </w:p>
+        </w:tc>
+        <w:tc>
+          <w:tcPr>
+            <w:tcW w:w="5400" w:type="dxa"/>
+            <w:tcBorders>
+              <w:top w:val="single" w:sz="6" w:space="0" w:color="auto"/>
+              <w:bottom w:val="single" w:sz="6" w:space="0" w:color="auto"/>
+              <w:right w:val="single" w:sz="12" w:space="0" w:color="auto"/>
+            </w:tcBorders>
+          </w:tcPr>
+          <w:p>
+            <w:pPr>
+              <w:pStyle w:val="BodyText"/>
+              <w:ind w:left="0"/>
+            </w:pPr>
+            <w:r>
+              <w:t>editing code, prompts or the database by hand</w:t>
+            </w:r>
+          </w:p>
+        </w:tc>
+      </w:tr>
+      <w:tr>
+        <w:tc>
+          <w:tcPr>
+            <w:tcW w:w="2790" w:type="dxa"/>
+            <w:tcBorders>
+              <w:top w:val="single" w:sz="6" w:space="0" w:color="auto"/>
+              <w:left w:val="single" w:sz="12" w:space="0" w:color="auto"/>
+              <w:bottom w:val="single" w:sz="12" w:space="0" w:color="auto"/>
+              <w:right w:val="single" w:sz="12" w:space="0" w:color="auto"/>
+            </w:tcBorders>
+            <w:shd w:val="pct25" w:color="auto" w:fill="auto"/>
+          </w:tcPr>
+          <w:p>
+            <w:pPr>
+              <w:pStyle w:val="BodyText"/>
+              <w:ind w:left="72"/>
+            </w:pPr>
+            <w:r>
+              <w:t>Our product</w:t>
+            </w:r>
+          </w:p>
+        </w:tc>
+        <w:tc>
+          <w:tcPr>
+            <w:tcW w:w="5400" w:type="dxa"/>
+            <w:tcBorders>
+              <w:top w:val="single" w:sz="6" w:space="0" w:color="auto"/>
+              <w:bottom w:val="single" w:sz="12" w:space="0" w:color="auto"/>
+              <w:right w:val="single" w:sz="12" w:space="0" w:color="auto"/>
+            </w:tcBorders>
+          </w:tcPr>
+          <w:p>
+            <w:pPr>
+              <w:pStyle w:val="BodyText"/>
+              <w:ind w:left="0"/>
+            </w:pPr>
+            <w:r>
+              <w:t>lets administrators update question templates, rubric texts and help pages, follow sessions, scores and AI errors, and answer support requests in one place, with access limited to the admin role</w:t>
+            </w:r>
+          </w:p>
+        </w:tc>
+      </w:tr>
+    </w:tbl>
+    <w:p>
+      <w:pPr>
         <w:pStyle w:val="Heading1"/>
       </w:pPr>
       <w:bookmarkStart w:id="22" w:name="_Toc447960005"/>
       <w:bookmarkStart w:id="23" w:name="_Toc452813581"/>
       <w:bookmarkStart w:id="24" w:name="_Toc512930909"/>
-      <w:bookmarkStart w:id="25" w:name="_Toc243064925"/>
-      <w:bookmarkStart w:id="26" w:name="_Toc436203381"/>
-      <w:r>
+      <w:bookmarkStart w:id="25" w:name="_Toc436203381"/>
+      <w:bookmarkStart w:id="26" w:name="_Toc244288161"/>
+      <w:r>
+        <w:lastRenderedPageBreak/>
         <w:t>Stakeholder and User Descriptions</w:t>
       </w:r>
       <w:bookmarkEnd w:id="22"/>
       <w:bookmarkEnd w:id="23"/>
       <w:bookmarkEnd w:id="24"/>
-      <w:bookmarkEnd w:id="25"/>
+      <w:bookmarkEnd w:id="26"/>
     </w:p>
     <w:p>
       <w:pPr>
@@ -3237,7 +4401,7 @@
       </w:pPr>
       <w:bookmarkStart w:id="27" w:name="_Toc452813583"/>
       <w:bookmarkStart w:id="28" w:name="_Toc512930910"/>
-      <w:bookmarkStart w:id="29" w:name="_Toc243064926"/>
+      <w:bookmarkStart w:id="29" w:name="_Toc244288162"/>
       <w:r>
         <w:t>Stakeholder Summary</w:t>
       </w:r>
@@ -3396,6 +4560,15 @@
               <w:ind w:left="0"/>
             </w:pPr>
             <w:r>
+              <w:t>• Act as administrators during the course: maintain content, monitor the system and support users</w:t>
+            </w:r>
+          </w:p>
+          <w:p>
+            <w:pPr>
+              <w:pStyle w:val="BodyText"/>
+              <w:ind w:left="0"/>
+            </w:pPr>
+            <w:r>
               <w:t>• Keep the system free to run (zero-cost stack)</w:t>
             </w:r>
           </w:p>
@@ -3488,11 +4661,7 @@
               <w:ind w:left="0"/>
             </w:pPr>
             <w:r>
-              <w:t xml:space="preserve">People who currently help students prepare (7/15 </w:t>
-            </w:r>
-            <w:r>
-              <w:lastRenderedPageBreak/>
-              <w:t>respondents want mentor feedback).</w:t>
+              <w:t>People who currently help students prepare (7/15 respondents want mentor feedback).</w:t>
             </w:r>
           </w:p>
         </w:tc>
@@ -3506,7 +4675,6 @@
               <w:ind w:left="0"/>
             </w:pPr>
             <w:r>
-              <w:lastRenderedPageBreak/>
               <w:t>• Review reports that candidates choose to share</w:t>
             </w:r>
           </w:p>
@@ -3516,7 +4684,6 @@
               <w:ind w:left="0"/>
             </w:pPr>
             <w:r>
-              <w:lastRenderedPageBreak/>
               <w:t>• Confirm that the feedback is realistic and useful</w:t>
             </w:r>
           </w:p>
@@ -3533,7 +4700,6 @@
               <w:ind w:left="0"/>
             </w:pPr>
             <w:r>
-              <w:lastRenderedPageBreak/>
               <w:t>External service providers</w:t>
             </w:r>
           </w:p>
@@ -3548,7 +4714,7 @@
               <w:ind w:left="0"/>
             </w:pPr>
             <w:r>
-              <w:t>Google (Gemini API), Supabase/Firebase, Vercel/Netlify.</w:t>
+              <w:t>Google (Gemini API), Supabase, Vercel/Netlify.</w:t>
             </w:r>
           </w:p>
         </w:tc>
@@ -3583,7 +4749,7 @@
       </w:pPr>
       <w:bookmarkStart w:id="30" w:name="_Toc452813584"/>
       <w:bookmarkStart w:id="31" w:name="_Toc512930911"/>
-      <w:bookmarkStart w:id="32" w:name="_Toc243064927"/>
+      <w:bookmarkStart w:id="32" w:name="_Toc244288163"/>
       <w:r>
         <w:t>User Summary</w:t>
       </w:r>
@@ -3803,6 +4969,7 @@
               <w:ind w:left="0"/>
             </w:pPr>
             <w:r>
+              <w:lastRenderedPageBreak/>
               <w:t>Career changer</w:t>
             </w:r>
           </w:p>
@@ -3916,6 +5083,94 @@
             </w:pPr>
             <w:r>
               <w:t>Represented by the candidate who shares the report</w:t>
+            </w:r>
+          </w:p>
+        </w:tc>
+      </w:tr>
+      <w:tr>
+        <w:trPr>
+          <w:trHeight w:val="976"/>
+        </w:trPr>
+        <w:tc>
+          <w:tcPr>
+            <w:tcW w:w="1498" w:type="dxa"/>
+          </w:tcPr>
+          <w:p>
+            <w:pPr>
+              <w:pStyle w:val="BodyText"/>
+              <w:ind w:left="0"/>
+            </w:pPr>
+            <w:r>
+              <w:t>Administrator</w:t>
+            </w:r>
+          </w:p>
+        </w:tc>
+        <w:tc>
+          <w:tcPr>
+            <w:tcW w:w="1382" w:type="dxa"/>
+          </w:tcPr>
+          <w:p>
+            <w:pPr>
+              <w:pStyle w:val="BodyText"/>
+              <w:ind w:left="0"/>
+            </w:pPr>
+            <w:r>
+              <w:t>Internal user with the admin role: members of the development team during the course, later content or support staff. Signs in with a normal account that has been given the admin role.</w:t>
+            </w:r>
+          </w:p>
+        </w:tc>
+        <w:tc>
+          <w:tcPr>
+            <w:tcW w:w="3240" w:type="dxa"/>
+          </w:tcPr>
+          <w:p>
+            <w:pPr>
+              <w:pStyle w:val="BodyText"/>
+              <w:ind w:left="0"/>
+            </w:pPr>
+            <w:r>
+              <w:t>• Creates and updates content: question templates by position and round, rubric descriptions, sample answers and help pages</w:t>
+            </w:r>
+          </w:p>
+          <w:p>
+            <w:pPr>
+              <w:pStyle w:val="BodyText"/>
+              <w:ind w:left="0"/>
+            </w:pPr>
+            <w:r>
+              <w:t>• Views reports: number of users and sessions, average scores by criterion, AI errors and quota usage, feedback flagged by users</w:t>
+            </w:r>
+          </w:p>
+          <w:p>
+            <w:pPr>
+              <w:pStyle w:val="BodyText"/>
+              <w:ind w:left="0"/>
+            </w:pPr>
+            <w:r>
+              <w:t>• Supports users: answers support requests, reviews flagged AI feedback, handles account and data-deletion problems, can lock abusive accounts</w:t>
+            </w:r>
+          </w:p>
+          <w:p>
+            <w:pPr>
+              <w:pStyle w:val="BodyText"/>
+              <w:ind w:left="0"/>
+            </w:pPr>
+            <w:r>
+              <w:t>• Sees aggregated data only; a candidate's CV and answers stay private unless the candidate reports that session</w:t>
+            </w:r>
+          </w:p>
+        </w:tc>
+        <w:tc>
+          <w:tcPr>
+            <w:tcW w:w="2628" w:type="dxa"/>
+          </w:tcPr>
+          <w:p>
+            <w:pPr>
+              <w:pStyle w:val="BodyText"/>
+              <w:ind w:left="0"/>
+            </w:pPr>
+            <w:r>
+              <w:t>Development team</w:t>
             </w:r>
           </w:p>
         </w:tc>
@@ -3937,7 +5192,7 @@
       <w:bookmarkStart w:id="37" w:name="_Toc436203384"/>
       <w:bookmarkStart w:id="38" w:name="_Toc452813585"/>
       <w:bookmarkStart w:id="39" w:name="_Toc512930912"/>
-      <w:bookmarkStart w:id="40" w:name="_Toc243064928"/>
+      <w:bookmarkStart w:id="40" w:name="_Toc244288164"/>
       <w:r>
         <w:t>User Environment</w:t>
       </w:r>
@@ -3967,7 +5222,10 @@
         <w:t>People involved:</w:t>
       </w:r>
       <w:r>
-        <w:t xml:space="preserve"> one candidate completes a practice session alone. A mentor may review the report later, asynchronously, through a share link.</w:t>
+        <w:rPr>
+          <w:b w:val="0"/>
+        </w:rPr>
+        <w:t xml:space="preserve"> one candidate completes a practice session alone. A mentor may review the report later, asynchronously, through a share link. Administrators work in a separate admin area, usually on a laptop, to update content, read reports and answer support requests.</w:t>
       </w:r>
     </w:p>
     <w:p>
@@ -3984,7 +5242,6 @@
         <w:rPr>
           <w:b/>
         </w:rPr>
-        <w:lastRenderedPageBreak/>
         <w:t>Task cycle:</w:t>
       </w:r>
       <w:r>
@@ -4077,7 +5334,7 @@
       </w:pPr>
       <w:bookmarkStart w:id="41" w:name="_Toc452813588"/>
       <w:bookmarkStart w:id="42" w:name="_Toc512930913"/>
-      <w:bookmarkStart w:id="43" w:name="_Toc243064929"/>
+      <w:bookmarkStart w:id="43" w:name="_Toc244288165"/>
       <w:r>
         <w:t>Summary of Key Stakeholder or User Needs</w:t>
       </w:r>
@@ -4489,11 +5746,7 @@
               <w:ind w:left="0"/>
             </w:pPr>
             <w:r>
-              <w:t xml:space="preserve">Knowledge gaps; last-minute revision is not effective </w:t>
-            </w:r>
-            <w:r>
-              <w:lastRenderedPageBreak/>
-              <w:t>(R13)</w:t>
+              <w:t>Knowledge gaps; last-minute revision is not effective (R13)</w:t>
             </w:r>
           </w:p>
         </w:tc>
@@ -4508,7 +5761,6 @@
               <w:ind w:left="0"/>
             </w:pPr>
             <w:r>
-              <w:lastRenderedPageBreak/>
               <w:t>Self-study</w:t>
             </w:r>
           </w:p>
@@ -4966,6 +6218,79 @@
           </w:p>
         </w:tc>
       </w:tr>
+      <w:tr>
+        <w:tc>
+          <w:tcPr>
+            <w:tcW w:w="2808" w:type="dxa"/>
+          </w:tcPr>
+          <w:p>
+            <w:pPr>
+              <w:pStyle w:val="BodyText"/>
+              <w:ind w:left="0"/>
+            </w:pPr>
+            <w:r>
+              <w:t>Keep content and AI quality up to date</w:t>
+            </w:r>
+          </w:p>
+        </w:tc>
+        <w:tc>
+          <w:tcPr>
+            <w:tcW w:w="900" w:type="dxa"/>
+          </w:tcPr>
+          <w:p>
+            <w:pPr>
+              <w:pStyle w:val="BodyText"/>
+              <w:ind w:left="0"/>
+            </w:pPr>
+            <w:r>
+              <w:t>Medium</w:t>
+            </w:r>
+          </w:p>
+        </w:tc>
+        <w:tc>
+          <w:tcPr>
+            <w:tcW w:w="1350" w:type="dxa"/>
+          </w:tcPr>
+          <w:p>
+            <w:pPr>
+              <w:pStyle w:val="BodyText"/>
+              <w:ind w:left="0"/>
+            </w:pPr>
+            <w:r>
+              <w:t>Outdated questions, unclear rubric texts, AI errors and user problems noticed late (lecturer review of PA1)</w:t>
+            </w:r>
+          </w:p>
+        </w:tc>
+        <w:tc>
+          <w:tcPr>
+            <w:tcW w:w="1980" w:type="dxa"/>
+            <w:gridSpan w:val="2"/>
+          </w:tcPr>
+          <w:p>
+            <w:pPr>
+              <w:pStyle w:val="BodyText"/>
+              <w:ind w:left="0"/>
+            </w:pPr>
+            <w:r>
+              <w:t>Edit code, prompts or the database by hand</w:t>
+            </w:r>
+          </w:p>
+        </w:tc>
+        <w:tc>
+          <w:tcPr>
+            <w:tcW w:w="2430" w:type="dxa"/>
+          </w:tcPr>
+          <w:p>
+            <w:pPr>
+              <w:pStyle w:val="BodyText"/>
+              <w:ind w:left="0"/>
+            </w:pPr>
+            <w:r>
+              <w:t>Admin area for content, reports and user support (feature 5.12)</w:t>
+            </w:r>
+          </w:p>
+        </w:tc>
+      </w:tr>
     </w:tbl>
     <w:p>
       <w:pPr>
@@ -4978,7 +6303,7 @@
       </w:pPr>
       <w:bookmarkStart w:id="44" w:name="_Toc452813589"/>
       <w:bookmarkStart w:id="45" w:name="_Toc512930914"/>
-      <w:bookmarkStart w:id="46" w:name="_Toc243064930"/>
+      <w:bookmarkStart w:id="46" w:name="_Toc244288166"/>
       <w:r>
         <w:t>Alternatives and Competition</w:t>
       </w:r>
@@ -5089,10 +6414,9 @@
       <w:bookmarkStart w:id="47" w:name="_Toc436203387"/>
       <w:bookmarkStart w:id="48" w:name="_Toc452813590"/>
       <w:bookmarkStart w:id="49" w:name="_Toc512930915"/>
-      <w:bookmarkStart w:id="50" w:name="_Toc243064931"/>
-      <w:bookmarkEnd w:id="26"/>
-      <w:r>
-        <w:lastRenderedPageBreak/>
+      <w:bookmarkStart w:id="50" w:name="_Toc244288167"/>
+      <w:bookmarkEnd w:id="25"/>
+      <w:r>
         <w:t>Product Overview</w:t>
       </w:r>
       <w:bookmarkEnd w:id="47"/>
@@ -5125,7 +6449,7 @@
       <w:bookmarkStart w:id="61" w:name="_Toc436203388"/>
       <w:bookmarkStart w:id="62" w:name="_Toc452813591"/>
       <w:bookmarkStart w:id="63" w:name="_Toc512930916"/>
-      <w:bookmarkStart w:id="64" w:name="_Toc243064932"/>
+      <w:bookmarkStart w:id="64" w:name="_Toc244288168"/>
       <w:r>
         <w:t>Product Perspective</w:t>
       </w:r>
@@ -5206,10 +6530,7 @@
         <w:rPr>
           <w:b/>
         </w:rPr>
-        <w:t>Authentication and database</w:t>
-      </w:r>
-      <w:r>
-        <w:t xml:space="preserve"> (Supabase or Firebase): email and Google sign-in, and storage of profiles, sessions, reports, bookmarks and plans.</w:t>
+        <w:t>Authentication and database (Supabase: Auth and PostgreSQL): email and Google sign-in, and storage of profiles, sessions, reports, bookmarks and plans.</w:t>
       </w:r>
     </w:p>
     <w:p>
@@ -5276,7 +6597,7 @@
                     <pic:cNvPicPr/>
                   </pic:nvPicPr>
                   <pic:blipFill>
-                    <a:blip r:embed="rId9"/>
+                    <a:blip r:embed="rId11"/>
                     <a:stretch>
                       <a:fillRect/>
                     </a:stretch>
@@ -5326,7 +6647,7 @@
       <w:bookmarkStart w:id="75" w:name="_Toc436203390"/>
       <w:bookmarkStart w:id="76" w:name="_Toc452813593"/>
       <w:bookmarkStart w:id="77" w:name="_Toc512930917"/>
-      <w:bookmarkStart w:id="78" w:name="_Toc243064933"/>
+      <w:bookmarkStart w:id="78" w:name="_Toc244288169"/>
       <w:r>
         <w:t>Assumptions and Dependencies</w:t>
       </w:r>
@@ -5370,7 +6691,7 @@
         <w:ind w:left="1080"/>
       </w:pPr>
       <w:r>
-        <w:t>Supabase or Firebase free tiers are sufficient for authentication and data storage for the expected number of users during the course.</w:t>
+        <w:t>Supabase free tiers are sufficient for authentication and data storage for the expected number of users during the course.</w:t>
       </w:r>
     </w:p>
     <w:p>
@@ -5426,7 +6747,6 @@
         <w:ind w:left="1080"/>
       </w:pPr>
       <w:r>
-        <w:lastRenderedPageBreak/>
         <w:t>AI-generated questions, scores and feedback are practice guidance and may contain mistakes; they are not a professional or hiring assessment.</w:t>
       </w:r>
     </w:p>
@@ -5455,18 +6775,10 @@
         <w:ind w:left="1080"/>
       </w:pPr>
       <w:r>
-        <w:t xml:space="preserve">The first version is free. Seven respondents might pay if the tool is effective, and six entered a monthly budget between VND 50,000 and 250,000, but a paid plan is out of scope for this </w:t>
-      </w:r>
-      <w:proofErr w:type="gramStart"/>
-      <w:r>
-        <w:t>course.</w:t>
-      </w:r>
-      <w:r>
-        <w:t>The</w:t>
-      </w:r>
-      <w:proofErr w:type="gramEnd"/>
-      <w:r>
-        <w:t xml:space="preserve"> product must be designed, built and tested by a five-person student team within five two-week sprints (5/10–13/12/2026) using free tools only.</w:t>
+        <w:t>The first version is free. Seven respondents might pay if the tool is effective, and six entered a monthly budget between VND 50,000 and 250,000, but a paid plan is out of scope for this course.</w:t>
+      </w:r>
+      <w:r>
+        <w:t>The product must be designed, built and tested by a five-person student team within five two-week sprints (5/10–13/12/2026) using free tools only.</w:t>
       </w:r>
     </w:p>
     <w:p>
@@ -5476,7 +6788,7 @@
       <w:bookmarkStart w:id="79" w:name="_Toc436203402"/>
       <w:bookmarkStart w:id="80" w:name="_Toc452813596"/>
       <w:bookmarkStart w:id="81" w:name="_Toc512930918"/>
-      <w:bookmarkStart w:id="82" w:name="_Toc243064934"/>
+      <w:bookmarkStart w:id="82" w:name="_Toc244288170"/>
       <w:r>
         <w:t>Product Features</w:t>
       </w:r>
@@ -5524,7 +6836,7 @@
       <w:pPr>
         <w:pStyle w:val="Heading2"/>
       </w:pPr>
-      <w:bookmarkStart w:id="83" w:name="_Toc243064935"/>
+      <w:bookmarkStart w:id="83" w:name="_Toc244288171"/>
       <w:r>
         <w:t>Sign-up, Login and User Profile</w:t>
       </w:r>
@@ -5565,7 +6877,7 @@
       <w:pPr>
         <w:pStyle w:val="Heading2"/>
       </w:pPr>
-      <w:bookmarkStart w:id="84" w:name="_Toc243064936"/>
+      <w:bookmarkStart w:id="84" w:name="_Toc244288172"/>
       <w:r>
         <w:t>JD and CV Input with Fit Analysis</w:t>
       </w:r>
@@ -5576,7 +6888,7 @@
         <w:pStyle w:val="BodyText"/>
       </w:pPr>
       <w:r>
-        <w:t>The user pastes a job description and uploads (PDF) or pastes a CV. The system extracts the required skills from the JD, compares them with the CV and shows matched skills and gaps. The user is told how the CV is used and can delete it at any time.</w:t>
+        <w:t>The user pastes a job description (up to 3,000 characters) and uploads a text-based PDF (up to 5 MB) or pastes a CV. The system extracts the required skills from the JD, compares them with the CV and shows a fit score, matched skills, gaps and advice. The PDF file is not stored; the extracted CV text, the JD and the result are saved to the user's account so the mock interview can use them, and the user can delete them at any time.</w:t>
       </w:r>
     </w:p>
     <w:p>
@@ -5606,7 +6918,7 @@
       <w:pPr>
         <w:pStyle w:val="Heading2"/>
       </w:pPr>
-      <w:bookmarkStart w:id="85" w:name="_Toc243064937"/>
+      <w:bookmarkStart w:id="85" w:name="_Toc244288173"/>
       <w:r>
         <w:t>Mock Interview Setup</w:t>
       </w:r>
@@ -5617,7 +6929,7 @@
         <w:pStyle w:val="BodyText"/>
       </w:pPr>
       <w:r>
-        <w:t>The user creates a mock interview by choosing the round (HR, technical or behavioural), difficulty and language (Vietnamese or English).</w:t>
+        <w:t>The user creates a mock interview by choosing the round (HR, technical or behavioural), difficulty, language (Vietnamese or English), target position, duration (15, 30 or 45 minutes) and answer mode (text or voice), and can enter the date of the real interview. The latest fit analysis is linked to the session.</w:t>
       </w:r>
     </w:p>
     <w:p>
@@ -5647,7 +6959,7 @@
       <w:pPr>
         <w:pStyle w:val="Heading2"/>
       </w:pPr>
-      <w:bookmarkStart w:id="86" w:name="_Toc243064938"/>
+      <w:bookmarkStart w:id="86" w:name="_Toc244288174"/>
       <w:r>
         <w:t>Chat-based Interview with Follow-up Questions</w:t>
       </w:r>
@@ -5688,7 +7000,7 @@
       <w:pPr>
         <w:pStyle w:val="Heading2"/>
       </w:pPr>
-      <w:bookmarkStart w:id="87" w:name="_Toc243064939"/>
+      <w:bookmarkStart w:id="87" w:name="_Toc244288175"/>
       <w:r>
         <w:t>Per-answer Scoring and Feedback</w:t>
       </w:r>
@@ -5729,7 +7041,7 @@
       <w:pPr>
         <w:pStyle w:val="Heading2"/>
       </w:pPr>
-      <w:bookmarkStart w:id="88" w:name="_Toc243064940"/>
+      <w:bookmarkStart w:id="88" w:name="_Toc244288176"/>
       <w:r>
         <w:t>Post-interview Report</w:t>
       </w:r>
@@ -5770,9 +7082,8 @@
       <w:pPr>
         <w:pStyle w:val="Heading2"/>
       </w:pPr>
-      <w:bookmarkStart w:id="89" w:name="_Toc243064941"/>
-      <w:r>
-        <w:lastRenderedPageBreak/>
+      <w:bookmarkStart w:id="89" w:name="_Toc244288177"/>
+      <w:r>
         <w:t>Targeted Practice Questions</w:t>
       </w:r>
       <w:bookmarkEnd w:id="89"/>
@@ -5812,7 +7123,7 @@
       <w:pPr>
         <w:pStyle w:val="Heading2"/>
       </w:pPr>
-      <w:bookmarkStart w:id="90" w:name="_Toc243064942"/>
+      <w:bookmarkStart w:id="90" w:name="_Toc244288178"/>
       <w:r>
         <w:t>Voice Answers</w:t>
       </w:r>
@@ -5853,7 +7164,7 @@
       <w:pPr>
         <w:pStyle w:val="Heading2"/>
       </w:pPr>
-      <w:bookmarkStart w:id="91" w:name="_Toc243064943"/>
+      <w:bookmarkStart w:id="91" w:name="_Toc244288179"/>
       <w:r>
         <w:t>History and Progress Tracking</w:t>
       </w:r>
@@ -5894,7 +7205,7 @@
       <w:pPr>
         <w:pStyle w:val="Heading2"/>
       </w:pPr>
-      <w:bookmarkStart w:id="92" w:name="_Toc243064944"/>
+      <w:bookmarkStart w:id="92" w:name="_Toc244288180"/>
       <w:r>
         <w:t>Practice-plan Agent</w:t>
       </w:r>
@@ -5935,7 +7246,7 @@
       <w:pPr>
         <w:pStyle w:val="Heading2"/>
       </w:pPr>
-      <w:bookmarkStart w:id="93" w:name="_Toc243064945"/>
+      <w:bookmarkStart w:id="93" w:name="_Toc244288181"/>
       <w:r>
         <w:t>PDF Export and Sharing</w:t>
       </w:r>
@@ -5974,29 +7285,70 @@
     </w:p>
     <w:p>
       <w:pPr>
+        <w:pStyle w:val="Heading2"/>
+      </w:pPr>
+      <w:bookmarkStart w:id="94" w:name="_Toc244288182"/>
+      <w:r>
+        <w:t>Administration: Content, Reports and Support</w:t>
+      </w:r>
+      <w:bookmarkEnd w:id="94"/>
+    </w:p>
+    <w:p>
+      <w:pPr>
+        <w:pStyle w:val="BodyText"/>
+      </w:pPr>
+      <w:r>
+        <w:t>Users with the admin role open a separate admin area. They create and update question templates, rubric descriptions, sample answers and help pages; view reports on users, sessions, scores, AI errors and quota usage; and handle support requests and AI feedback that users flag as wrong. Reports show aggregated data only, and normal users cannot open the admin area.</w:t>
+      </w:r>
+    </w:p>
+    <w:p>
+      <w:pPr>
+        <w:pStyle w:val="BodyText"/>
+      </w:pPr>
+      <w:r>
+        <w:rPr>
+          <w:b/>
+        </w:rPr>
+        <w:t>Priority:</w:t>
+      </w:r>
+      <w:r>
+        <w:t xml:space="preserve"> Could   </w:t>
+      </w:r>
+      <w:r>
+        <w:rPr>
+          <w:b/>
+        </w:rPr>
+        <w:t>Source:</w:t>
+      </w:r>
+      <w:r>
+        <w:t xml:space="preserve"> lecturer review of PA1 (no survey question)</w:t>
+      </w:r>
+    </w:p>
+    <w:p>
+      <w:pPr>
         <w:pStyle w:val="Heading1"/>
       </w:pPr>
-      <w:bookmarkStart w:id="94" w:name="_Toc436203408"/>
-      <w:bookmarkStart w:id="95" w:name="_Toc452813602"/>
-      <w:bookmarkStart w:id="96" w:name="_Toc512930919"/>
-      <w:bookmarkStart w:id="97" w:name="_Toc243064946"/>
+      <w:bookmarkStart w:id="95" w:name="_Toc436203408"/>
+      <w:bookmarkStart w:id="96" w:name="_Toc452813602"/>
+      <w:bookmarkStart w:id="97" w:name="_Toc512930919"/>
+      <w:bookmarkStart w:id="98" w:name="_Toc244288183"/>
       <w:r>
         <w:t>Non-Functional</w:t>
       </w:r>
       <w:r>
         <w:t xml:space="preserve"> Requirements</w:t>
       </w:r>
-      <w:bookmarkEnd w:id="94"/>
       <w:bookmarkEnd w:id="95"/>
       <w:bookmarkEnd w:id="96"/>
       <w:bookmarkEnd w:id="97"/>
-    </w:p>
-    <w:p>
-      <w:pPr>
-        <w:pStyle w:val="BodyText"/>
-      </w:pPr>
-      <w:r>
-        <w:t>The following requirements apply to the product as a whole. They are initial targets and will be refined in the supplementary specification.</w:t>
+      <w:bookmarkEnd w:id="98"/>
+    </w:p>
+    <w:p>
+      <w:pPr>
+        <w:pStyle w:val="BodyText"/>
+      </w:pPr>
+      <w:r>
+        <w:t>The following requirements apply to the product as a whole. Each one has an ID; its exact measure and test method are given in the Supplementary Specification [6], which is the reference for testing.</w:t>
       </w:r>
     </w:p>
     <w:p>
@@ -6021,7 +7373,7 @@
         <w:ind w:left="1080"/>
       </w:pPr>
       <w:r>
-        <w:t>A first-time user can sign up and start a first mock interview within 5 minutes without help.</w:t>
+        <w:t>NFR-US-01: A first-time user can sign up and start a first mock interview within 5 minutes without help (at least 4 of 5 testers).</w:t>
       </w:r>
     </w:p>
     <w:p>
@@ -6035,7 +7387,7 @@
         <w:ind w:left="1080"/>
       </w:pPr>
       <w:r>
-        <w:t>The interface is available in Vietnamese and English, and the layout is responsive from 360 px phone screens to desktop screens.</w:t>
+        <w:t>NFR-US-02, NFR-US-03: Interviews, feedback and reports are produced in the chosen language (Vietnamese or English), and the layout works from 360 px phone screens to desktop screens without horizontal scrolling.</w:t>
       </w:r>
     </w:p>
     <w:p>
@@ -6049,7 +7401,7 @@
         <w:ind w:left="1080"/>
       </w:pPr>
       <w:r>
-        <w:t>Feedback is written in plain language and always explains why a score was given.</w:t>
+        <w:t>NFR-US-04, NFR-AI-02: Feedback and error messages are written in plain language; feedback always explains why a score was given, and every error tells the user what to do next.</w:t>
       </w:r>
     </w:p>
     <w:p>
@@ -6074,7 +7426,7 @@
         <w:ind w:left="1080"/>
       </w:pPr>
       <w:r>
-        <w:t>The AI's next question or follow-up appears within 5 seconds in normal conditions (about 95% of requests).</w:t>
+        <w:t>NFR-PF-01: The AI's next question or follow-up appears within 5 seconds for 95% of requests.</w:t>
       </w:r>
     </w:p>
     <w:p>
@@ -6088,7 +7440,7 @@
         <w:ind w:left="1080"/>
       </w:pPr>
       <w:r>
-        <w:t>Per-answer feedback appears within 10 seconds; a full post-interview report is generated within 30 seconds.</w:t>
+        <w:t>NFR-PF-02, NFR-PF-03, NFR-PF-04: Per-answer feedback appears within 10 seconds, the JD/CV fit analysis within 15 seconds and the full report within 30 seconds, for 95% of requests.</w:t>
       </w:r>
     </w:p>
     <w:p>
@@ -6102,7 +7454,7 @@
         <w:ind w:left="1080"/>
       </w:pPr>
       <w:r>
-        <w:t>Pages other than AI responses load within 3 seconds on a typical 4G or broadband connection.</w:t>
+        <w:t>NFR-PF-05: Pages without AI calls load within 3 seconds (Largest Contentful Paint, Lighthouse mobile).</w:t>
       </w:r>
     </w:p>
     <w:p>
@@ -6127,7 +7479,7 @@
         <w:ind w:left="1080"/>
       </w:pPr>
       <w:r>
-        <w:t>Answers are saved after every turn, so an interrupted session (closed tab, lost connection) can be resumed.</w:t>
+        <w:t>NFR-RL-01: Answers are saved after every turn, so an interrupted session (closed tab, lost connection) can be resumed with no answered turn lost.</w:t>
       </w:r>
     </w:p>
     <w:p>
@@ -6141,7 +7493,7 @@
         <w:ind w:left="1080"/>
       </w:pPr>
       <w:r>
-        <w:t>When the AI service fails or the quota is exceeded, the user sees a clear message and can retry; no data is lost.</w:t>
+        <w:t>NFR-RL-02, NFR-RL-03: When the AI service fails or the quota is exceeded, the user sees a clear message and a Retry button and no input is lost; invalid AI output is never shown.</w:t>
       </w:r>
     </w:p>
     <w:p>
@@ -6155,7 +7507,7 @@
         <w:ind w:left="1080"/>
       </w:pPr>
       <w:r>
-        <w:t>The deployed demo is available during the course's review and demo periods.</w:t>
+        <w:t>NFR-RL-04: The staging site is available during the course's review and demo periods (health check passes in at least 95% of daily checks).</w:t>
       </w:r>
     </w:p>
     <w:p>
@@ -6180,7 +7532,7 @@
         <w:ind w:left="1080"/>
       </w:pPr>
       <w:r>
-        <w:t>All traffic uses HTTPS; passwords are handled only by the authentication provider.</w:t>
+        <w:t>NFR-SC-01, NFR-SC-02: All traffic uses HTTPS; passwords are handled only by the authentication provider (Supabase Auth).</w:t>
       </w:r>
     </w:p>
     <w:p>
@@ -6194,8 +7546,7 @@
         <w:ind w:left="1080"/>
       </w:pPr>
       <w:r>
-        <w:lastRenderedPageBreak/>
-        <w:t>The website explains how CVs and practice data are used before they are stored, asks for permission before storing audio, and lets users delete their CVs, recordings and history.</w:t>
+        <w:t>NFR-SC-05, NFR-SC-06, NFR-SC-07: The website explains how CVs and practice data are used before they are stored, does not store CV files, asks for permission before storing audio, and lets users delete their CV text, recordings and history.</w:t>
       </w:r>
     </w:p>
     <w:p>
@@ -6209,7 +7560,7 @@
         <w:ind w:left="1080"/>
       </w:pPr>
       <w:r>
-        <w:t>Each user can access only their own data; reports are shared only when the user creates a link, links are read-only, hard to guess and can be revoked.</w:t>
+        <w:t>NFR-SC-03, NFR-SC-08: Each user can access only their own data (Row Level Security on every table); reports are shared only when the user creates a link, and links are read-only, hard to guess and can be revoked.</w:t>
       </w:r>
     </w:p>
     <w:p>
@@ -6223,18 +7574,7 @@
         <w:ind w:left="1080"/>
       </w:pPr>
       <w:r>
-        <w:t>API keys are kept on the server and never exposed to the browser.</w:t>
-      </w:r>
-    </w:p>
-    <w:p>
-      <w:pPr>
-        <w:pStyle w:val="BodyText"/>
-      </w:pPr>
-      <w:r>
-        <w:rPr>
-          <w:b/>
-        </w:rPr>
-        <w:t>AI quality and responsible use</w:t>
+        <w:t>NFR-SC-04: API keys are kept on the server and never appear in the browser or in Git.</w:t>
       </w:r>
     </w:p>
     <w:p>
@@ -6248,7 +7588,18 @@
         <w:ind w:left="1080"/>
       </w:pPr>
       <w:r>
-        <w:t>Scoring uses the same rubric and prompt templates for every answer so that results are consistent.</w:t>
+        <w:t>NFR-SC-09: Only accounts with the admin role can open the admin area and its reports, and the reports show aggregated data only.</w:t>
+      </w:r>
+    </w:p>
+    <w:p>
+      <w:pPr>
+        <w:pStyle w:val="BodyText"/>
+      </w:pPr>
+      <w:r>
+        <w:rPr>
+          <w:b/>
+        </w:rPr>
+        <w:t>AI quality and responsible use</w:t>
       </w:r>
     </w:p>
     <w:p>
@@ -6262,7 +7613,7 @@
         <w:ind w:left="1080"/>
       </w:pPr>
       <w:r>
-        <w:t>Feedback must be specific to the user's answer and must not be generic praise.</w:t>
+        <w:t>NFR-AI-01: Scoring uses the same rubric and prompt templates for every answer so that results are consistent.</w:t>
       </w:r>
     </w:p>
     <w:p>
@@ -6276,7 +7627,7 @@
         <w:ind w:left="1080"/>
       </w:pPr>
       <w:r>
-        <w:t>The website states clearly that AI feedback is practice guidance and may contain mistakes.</w:t>
+        <w:t>NFR-AI-02, NFR-AI-03: Feedback must be specific to the user's answer, and the fit analysis must be based on evidence from the CV and JD.</w:t>
       </w:r>
     </w:p>
     <w:p>
@@ -6290,18 +7641,7 @@
         <w:ind w:left="1080"/>
       </w:pPr>
       <w:r>
-        <w:t>Questions and feedback must not contain offensive or discriminatory content.</w:t>
-      </w:r>
-    </w:p>
-    <w:p>
-      <w:pPr>
-        <w:pStyle w:val="BodyText"/>
-      </w:pPr>
-      <w:r>
-        <w:rPr>
-          <w:b/>
-        </w:rPr>
-        <w:t>Compatibility and platform</w:t>
+        <w:t>NFR-AI-04: The website states clearly that AI feedback is practice guidance and may contain mistakes.</w:t>
       </w:r>
     </w:p>
     <w:p>
@@ -6315,7 +7655,7 @@
         <w:ind w:left="1080"/>
       </w:pPr>
       <w:r>
-        <w:t>Supports the latest two versions of Chrome, Edge, Safari and Firefox on Windows, macOS, Linux, Android and iOS. Voice input is required only on Chrome and Edge.</w:t>
+        <w:t>NFR-AI-05: Questions and feedback must not contain offensive or discriminatory content.</w:t>
       </w:r>
     </w:p>
     <w:p>
@@ -6326,7 +7666,7 @@
         <w:rPr>
           <w:b/>
         </w:rPr>
-        <w:t>Design constraints and cost</w:t>
+        <w:t>Compatibility and platform</w:t>
       </w:r>
     </w:p>
     <w:p>
@@ -6340,7 +7680,18 @@
         <w:ind w:left="1080"/>
       </w:pPr>
       <w:r>
-        <w:t>Built with Next.js/React, Tailwind CSS, Supabase or Firebase and the Gemini API, and deployed on Vercel or Netlify.</w:t>
+        <w:t>NFR-CP-01, NFR-CP-02: Supports the latest two versions of Chrome, Edge, Safari and Firefox on Windows, macOS, Android and iOS. Voice input is required only on Chrome and Edge; typing always works.</w:t>
+      </w:r>
+    </w:p>
+    <w:p>
+      <w:pPr>
+        <w:pStyle w:val="BodyText"/>
+      </w:pPr>
+      <w:r>
+        <w:rPr>
+          <w:b/>
+        </w:rPr>
+        <w:t>Design constraints and cost</w:t>
       </w:r>
     </w:p>
     <w:p>
@@ -6354,18 +7705,7 @@
         <w:ind w:left="1080"/>
       </w:pPr>
       <w:r>
-        <w:t>The whole system must run on free tiers (zero operating cost).</w:t>
-      </w:r>
-    </w:p>
-    <w:p>
-      <w:pPr>
-        <w:pStyle w:val="BodyText"/>
-      </w:pPr>
-      <w:r>
-        <w:rPr>
-          <w:b/>
-        </w:rPr>
-        <w:t>Maintainability</w:t>
+        <w:t>Built with Next.js 16 (TypeScript), Tailwind CSS, Supabase and the Gemini API, and deployed on Vercel or Netlify (NFR-CN-01).</w:t>
       </w:r>
     </w:p>
     <w:p>
@@ -6379,7 +7719,18 @@
         <w:ind w:left="1080"/>
       </w:pPr>
       <w:r>
-        <w:t>Source code and documents are stored in the team's GitHub repository with the agreed folder structure (/src, /docs, /pa).</w:t>
+        <w:t>NFR-CN-02: The whole system must run on free tiers (zero operating cost).</w:t>
+      </w:r>
+    </w:p>
+    <w:p>
+      <w:pPr>
+        <w:pStyle w:val="BodyText"/>
+      </w:pPr>
+      <w:r>
+        <w:rPr>
+          <w:b/>
+        </w:rPr>
+        <w:t>Maintainability</w:t>
       </w:r>
     </w:p>
     <w:p>
@@ -6393,18 +7744,7 @@
         <w:ind w:left="1080"/>
       </w:pPr>
       <w:r>
-        <w:t>AI prompts and the scoring rubric are kept in configuration files so they can be changed without changing application logic.</w:t>
-      </w:r>
-    </w:p>
-    <w:p>
-      <w:pPr>
-        <w:pStyle w:val="BodyText"/>
-      </w:pPr>
-      <w:r>
-        <w:rPr>
-          <w:b/>
-        </w:rPr>
-        <w:t>Documentation</w:t>
+        <w:t>NFR-MT-01, NFR-MT-02: Source code and documents are stored in the team's GitHub repository with the agreed folder structure (/src, /docs, /pa), and main always builds and passes its tests.</w:t>
       </w:r>
     </w:p>
     <w:p>
@@ -6418,7 +7758,18 @@
         <w:ind w:left="1080"/>
       </w:pPr>
       <w:r>
-        <w:t>A short in-app help page or onboarding tour explains how to run a mock interview and read the report.</w:t>
+        <w:t>NFR-MT-03: AI prompts and the scoring rubric are kept in their own files so they can be changed without changing application logic.</w:t>
+      </w:r>
+    </w:p>
+    <w:p>
+      <w:pPr>
+        <w:pStyle w:val="BodyText"/>
+      </w:pPr>
+      <w:r>
+        <w:rPr>
+          <w:b/>
+        </w:rPr>
+        <w:t>Documentation</w:t>
       </w:r>
     </w:p>
     <w:p>
@@ -6432,12 +7783,26 @@
         <w:ind w:left="1080"/>
       </w:pPr>
       <w:r>
+        <w:t>NFR-DC-01: A short in-app help page explains how to run a mock interview and read the report.</w:t>
+      </w:r>
+    </w:p>
+    <w:p>
+      <w:pPr>
+        <w:pStyle w:val="BodyText"/>
+        <w:numPr>
+          <w:ilvl w:val="0"/>
+          <w:numId w:val="9"/>
+        </w:numPr>
+        <w:spacing w:after="60"/>
+        <w:ind w:left="1080"/>
+      </w:pPr>
+      <w:r>
         <w:t>A README describes how to set up, configure and deploy the system.</w:t>
       </w:r>
     </w:p>
     <w:sectPr>
-      <w:headerReference w:type="default" r:id="rId10"/>
-      <w:footerReference w:type="default" r:id="rId11"/>
+      <w:headerReference w:type="default" r:id="rId12"/>
+      <w:footerReference w:type="default" r:id="rId13"/>
       <w:pgSz w:w="12240" w:h="15840" w:code="1"/>
       <w:pgMar w:top="1440" w:right="1440" w:bottom="1440" w:left="1440" w:header="720" w:footer="720" w:gutter="0"/>
       <w:cols w:space="720"/>
@@ -6533,13 +7898,7 @@
             <w:rPr>
               <w:lang w:val="vi-VN"/>
             </w:rPr>
-            <w:t xml:space="preserve"> </w:t>
-          </w:r>
-          <w:r>
-            <w:rPr>
-              <w:lang w:val="vi-VN"/>
-            </w:rPr>
-            <w:t>G</w:t>
+            <w:t xml:space="preserve"> G</w:t>
           </w:r>
           <w:r>
             <w:t>ROUP</w:t>
@@ -6662,6 +8021,16 @@
 <w:hdr xmlns:wpc="http://schemas.microsoft.com/office/word/2010/wordprocessingCanvas" xmlns:cx="http://schemas.microsoft.com/office/drawing/2014/chartex" xmlns:cx1="http://schemas.microsoft.com/office/drawing/2015/9/8/chartex" xmlns:cx2="http://schemas.microsoft.com/office/drawing/2015/10/21/chartex" xmlns:cx3="http://schemas.microsoft.com/office/drawing/2016/5/9/chartex" xmlns:cx4="http://schemas.microsoft.com/office/drawing/2016/5/10/chartex" xmlns:cx5="http://schemas.microsoft.com/office/drawing/2016/5/11/chartex" xmlns:cx6="http://schemas.microsoft.com/office/drawing/2016/5/12/chartex" xmlns:cx7="http://schemas.microsoft.com/office/drawing/2016/5/13/chartex" xmlns:cx8="http://schemas.microsoft.com/office/drawing/2016/5/14/chartex" xmlns:mc="http://schemas.openxmlformats.org/markup-compatibility/2006" xmlns:aink="http://schemas.microsoft.com/office/drawing/2016/ink" xmlns:am3d="http://schemas.microsoft.com/office/drawing/2017/model3d" xmlns:o="urn:schemas-microsoft-com:office:office" xmlns:oel="http://schemas.microsoft.com/office/2019/extlst" xmlns:r="http://schemas.openxmlformats.org/officeDocument/2006/relationships" xmlns:m="http://schemas.openxmlformats.org/officeDocument/2006/math" xmlns:v="urn:schemas-microsoft-com:vml" xmlns:wp14="http://schemas.microsoft.com/office/word/2010/wordprocessingDrawing" xmlns:wp="http://schemas.openxmlformats.org/drawingml/2006/wordprocessingDrawing" xmlns:w10="urn:schemas-microsoft-com:office:word" xmlns:w="http://schemas.openxmlformats.org/wordprocessingml/2006/main" xmlns:w14="http://schemas.microsoft.com/office/word/2010/wordml" xmlns:w15="http://schemas.microsoft.com/office/word/2012/wordml" xmlns:w16cex="http://schemas.microsoft.com/office/word/2018/wordml/cex" xmlns:w16cid="http://schemas.microsoft.com/office/word/2016/wordml/cid" xmlns:w16="http://schemas.microsoft.com/office/word/2018/wordml" xmlns:w16du="http://schemas.microsoft.com/office/word/2023/wordml/word16du" xmlns:w16sdtdh="http://schemas.microsoft.com/office/word/2020/wordml/sdtdatahash" xmlns:w16sdtfl="http://schemas.microsoft.com/office/word/2024/wordml/sdtformatlock" xmlns:w16se="http://schemas.microsoft.com/office/word/2015/wordml/symex" xmlns:wpg="http://schemas.microsoft.com/office/word/2010/wordprocessingGroup" xmlns:wpi="http://schemas.microsoft.com/office/word/2010/wordprocessingInk" xmlns:wne="http://schemas.microsoft.com/office/word/2006/wordml" xmlns:wps="http://schemas.microsoft.com/office/word/2010/wordprocessingShape" mc:Ignorable="w14 w15 w16se w16cid w16 w16cex w16sdtdh w16sdtfl w16du wp14">
   <w:p>
     <w:pPr>
+      <w:pStyle w:val="Header"/>
+    </w:pPr>
+  </w:p>
+</w:hdr>
+</file>
+
+<file path=word/header2.xml><?xml version="1.0" encoding="utf-8"?>
+<w:hdr xmlns:wpc="http://schemas.microsoft.com/office/word/2010/wordprocessingCanvas" xmlns:cx="http://schemas.microsoft.com/office/drawing/2014/chartex" xmlns:cx1="http://schemas.microsoft.com/office/drawing/2015/9/8/chartex" xmlns:cx2="http://schemas.microsoft.com/office/drawing/2015/10/21/chartex" xmlns:cx3="http://schemas.microsoft.com/office/drawing/2016/5/9/chartex" xmlns:cx4="http://schemas.microsoft.com/office/drawing/2016/5/10/chartex" xmlns:cx5="http://schemas.microsoft.com/office/drawing/2016/5/11/chartex" xmlns:cx6="http://schemas.microsoft.com/office/drawing/2016/5/12/chartex" xmlns:cx7="http://schemas.microsoft.com/office/drawing/2016/5/13/chartex" xmlns:cx8="http://schemas.microsoft.com/office/drawing/2016/5/14/chartex" xmlns:mc="http://schemas.openxmlformats.org/markup-compatibility/2006" xmlns:aink="http://schemas.microsoft.com/office/drawing/2016/ink" xmlns:am3d="http://schemas.microsoft.com/office/drawing/2017/model3d" xmlns:o="urn:schemas-microsoft-com:office:office" xmlns:oel="http://schemas.microsoft.com/office/2019/extlst" xmlns:r="http://schemas.openxmlformats.org/officeDocument/2006/relationships" xmlns:m="http://schemas.openxmlformats.org/officeDocument/2006/math" xmlns:v="urn:schemas-microsoft-com:vml" xmlns:wp14="http://schemas.microsoft.com/office/word/2010/wordprocessingDrawing" xmlns:wp="http://schemas.openxmlformats.org/drawingml/2006/wordprocessingDrawing" xmlns:w10="urn:schemas-microsoft-com:office:word" xmlns:w="http://schemas.openxmlformats.org/wordprocessingml/2006/main" xmlns:w14="http://schemas.microsoft.com/office/word/2010/wordml" xmlns:w15="http://schemas.microsoft.com/office/word/2012/wordml" xmlns:w16cex="http://schemas.microsoft.com/office/word/2018/wordml/cex" xmlns:w16cid="http://schemas.microsoft.com/office/word/2016/wordml/cid" xmlns:w16="http://schemas.microsoft.com/office/word/2018/wordml" xmlns:w16du="http://schemas.microsoft.com/office/word/2023/wordml/word16du" xmlns:w16sdtdh="http://schemas.microsoft.com/office/word/2020/wordml/sdtdatahash" xmlns:w16sdtfl="http://schemas.microsoft.com/office/word/2024/wordml/sdtformatlock" xmlns:w16se="http://schemas.microsoft.com/office/word/2015/wordml/symex" xmlns:wpg="http://schemas.microsoft.com/office/word/2010/wordprocessingGroup" xmlns:wpi="http://schemas.microsoft.com/office/word/2010/wordprocessingInk" xmlns:wne="http://schemas.microsoft.com/office/word/2006/wordml" xmlns:wps="http://schemas.microsoft.com/office/word/2010/wordprocessingShape" mc:Ignorable="w14 w15 w16se w16cid w16 w16cex w16sdtdh w16sdtfl w16du wp14">
+  <w:p>
+    <w:pPr>
       <w:rPr>
         <w:sz w:val="24"/>
       </w:rPr>
@@ -6725,7 +8094,17 @@
 </w:hdr>
 </file>
 
-<file path=word/header2.xml><?xml version="1.0" encoding="utf-8"?>
+<file path=word/header3.xml><?xml version="1.0" encoding="utf-8"?>
+<w:hdr xmlns:wpc="http://schemas.microsoft.com/office/word/2010/wordprocessingCanvas" xmlns:cx="http://schemas.microsoft.com/office/drawing/2014/chartex" xmlns:cx1="http://schemas.microsoft.com/office/drawing/2015/9/8/chartex" xmlns:cx2="http://schemas.microsoft.com/office/drawing/2015/10/21/chartex" xmlns:cx3="http://schemas.microsoft.com/office/drawing/2016/5/9/chartex" xmlns:cx4="http://schemas.microsoft.com/office/drawing/2016/5/10/chartex" xmlns:cx5="http://schemas.microsoft.com/office/drawing/2016/5/11/chartex" xmlns:cx6="http://schemas.microsoft.com/office/drawing/2016/5/12/chartex" xmlns:cx7="http://schemas.microsoft.com/office/drawing/2016/5/13/chartex" xmlns:cx8="http://schemas.microsoft.com/office/drawing/2016/5/14/chartex" xmlns:mc="http://schemas.openxmlformats.org/markup-compatibility/2006" xmlns:aink="http://schemas.microsoft.com/office/drawing/2016/ink" xmlns:am3d="http://schemas.microsoft.com/office/drawing/2017/model3d" xmlns:o="urn:schemas-microsoft-com:office:office" xmlns:oel="http://schemas.microsoft.com/office/2019/extlst" xmlns:r="http://schemas.openxmlformats.org/officeDocument/2006/relationships" xmlns:m="http://schemas.openxmlformats.org/officeDocument/2006/math" xmlns:v="urn:schemas-microsoft-com:vml" xmlns:wp14="http://schemas.microsoft.com/office/word/2010/wordprocessingDrawing" xmlns:wp="http://schemas.openxmlformats.org/drawingml/2006/wordprocessingDrawing" xmlns:w10="urn:schemas-microsoft-com:office:word" xmlns:w="http://schemas.openxmlformats.org/wordprocessingml/2006/main" xmlns:w14="http://schemas.microsoft.com/office/word/2010/wordml" xmlns:w15="http://schemas.microsoft.com/office/word/2012/wordml" xmlns:w16cex="http://schemas.microsoft.com/office/word/2018/wordml/cex" xmlns:w16cid="http://schemas.microsoft.com/office/word/2016/wordml/cid" xmlns:w16="http://schemas.microsoft.com/office/word/2018/wordml" xmlns:w16du="http://schemas.microsoft.com/office/word/2023/wordml/word16du" xmlns:w16sdtdh="http://schemas.microsoft.com/office/word/2020/wordml/sdtdatahash" xmlns:w16sdtfl="http://schemas.microsoft.com/office/word/2024/wordml/sdtformatlock" xmlns:w16se="http://schemas.microsoft.com/office/word/2015/wordml/symex" xmlns:wpg="http://schemas.microsoft.com/office/word/2010/wordprocessingGroup" xmlns:wpi="http://schemas.microsoft.com/office/word/2010/wordprocessingInk" xmlns:wne="http://schemas.microsoft.com/office/word/2006/wordml" xmlns:wps="http://schemas.microsoft.com/office/word/2010/wordprocessingShape" mc:Ignorable="w14 w15 w16se w16cid w16 w16cex w16sdtdh w16sdtfl w16du wp14">
+  <w:p>
+    <w:pPr>
+      <w:pStyle w:val="Header"/>
+    </w:pPr>
+  </w:p>
+</w:hdr>
+</file>
+
+<file path=word/header4.xml><?xml version="1.0" encoding="utf-8"?>
 <w:hdr xmlns:wpc="http://schemas.microsoft.com/office/word/2010/wordprocessingCanvas" xmlns:cx="http://schemas.microsoft.com/office/drawing/2014/chartex" xmlns:cx1="http://schemas.microsoft.com/office/drawing/2015/9/8/chartex" xmlns:cx2="http://schemas.microsoft.com/office/drawing/2015/10/21/chartex" xmlns:cx3="http://schemas.microsoft.com/office/drawing/2016/5/9/chartex" xmlns:cx4="http://schemas.microsoft.com/office/drawing/2016/5/10/chartex" xmlns:cx5="http://schemas.microsoft.com/office/drawing/2016/5/11/chartex" xmlns:cx6="http://schemas.microsoft.com/office/drawing/2016/5/12/chartex" xmlns:cx7="http://schemas.microsoft.com/office/drawing/2016/5/13/chartex" xmlns:cx8="http://schemas.microsoft.com/office/drawing/2016/5/14/chartex" xmlns:mc="http://schemas.openxmlformats.org/markup-compatibility/2006" xmlns:aink="http://schemas.microsoft.com/office/drawing/2016/ink" xmlns:am3d="http://schemas.microsoft.com/office/drawing/2017/model3d" xmlns:o="urn:schemas-microsoft-com:office:office" xmlns:oel="http://schemas.microsoft.com/office/2019/extlst" xmlns:r="http://schemas.openxmlformats.org/officeDocument/2006/relationships" xmlns:m="http://schemas.openxmlformats.org/officeDocument/2006/math" xmlns:v="urn:schemas-microsoft-com:vml" xmlns:wp14="http://schemas.microsoft.com/office/word/2010/wordprocessingDrawing" xmlns:wp="http://schemas.openxmlformats.org/drawingml/2006/wordprocessingDrawing" xmlns:w10="urn:schemas-microsoft-com:office:word" xmlns:w="http://schemas.openxmlformats.org/wordprocessingml/2006/main" xmlns:w14="http://schemas.microsoft.com/office/word/2010/wordml" xmlns:w15="http://schemas.microsoft.com/office/word/2012/wordml" xmlns:w16cex="http://schemas.microsoft.com/office/word/2018/wordml/cex" xmlns:w16cid="http://schemas.microsoft.com/office/word/2016/wordml/cid" xmlns:w16="http://schemas.microsoft.com/office/word/2018/wordml" xmlns:w16du="http://schemas.microsoft.com/office/word/2023/wordml/word16du" xmlns:w16sdtdh="http://schemas.microsoft.com/office/word/2020/wordml/sdtdatahash" xmlns:w16sdtfl="http://schemas.microsoft.com/office/word/2024/wordml/sdtformatlock" xmlns:w16se="http://schemas.microsoft.com/office/word/2015/wordml/symex" xmlns:wpg="http://schemas.microsoft.com/office/word/2010/wordprocessingGroup" xmlns:wpi="http://schemas.microsoft.com/office/word/2010/wordprocessingInk" xmlns:wne="http://schemas.microsoft.com/office/word/2006/wordml" xmlns:wps="http://schemas.microsoft.com/office/word/2010/wordprocessingShape" mc:Ignorable="w14 w15 w16se w16cid w16 w16cex w16sdtdh w16sdtfl w16du wp14">
   <w:tbl>
     <w:tblPr>
@@ -6793,7 +8172,7 @@
             <w:ind w:right="68"/>
           </w:pPr>
           <w:r>
-            <w:t xml:space="preserve">  Version:           1.1</w:t>
+            <w:t xml:space="preserve">  Version:           1.2</w:t>
           </w:r>
         </w:p>
       </w:tc>
@@ -6817,7 +8196,7 @@
         </w:tcPr>
         <w:p>
           <w:r>
-            <w:t xml:space="preserve">  Date:  16/Oct/26</w:t>
+            <w:t xml:space="preserve">  Date:  30/Oct/26</w:t>
           </w:r>
         </w:p>
       </w:tc>

</xml_diff>